<commit_message>
Campo, go-no-go y Pruebas: el primer lunes en produccion, con cifras
- Campo/02: el 14-sep se instalaron siete TAGs con SATAG y ocho con el proceso
  en papel. Ciclo completo en siete de siete, mediana de 8 minutos del envio
  del formulario al TAG instalado, cero recaptura, y lo que se observo: ZK no
  activaba el stock, Administracion llamaba a TI tras cada cobro, el caso del
  gestionante distinto del conductor y la correccion de placas en campo.
- Go-no-go, seccion 9: llenada con lo que consta, lo que queda por confirmar
  y las 11 firmas sin expediente que la limpieza no borro (ninguna posterior
  a la apertura).
- Pruebas/02: F-01 cerrado con observacion de rol (instalaron perfiles super,
  no una cuenta ti), F-04 sigue abierto, y U-01, U-02 y U-04 con resultados.
- La consulta de solo lectura que produjo las cifras.
</commit_message>
<xml_diff>
--- a/Plan de Direccion/08 - Go-no-go 11-sep y verificacion final.docx
+++ b/Plan de Direccion/08 - Go-no-go 11-sep y verificacion final.docx
@@ -20,25 +20,17 @@
     </w:p>
     <w:p>
       <w:pPr>
-        <w:pStyle w:val="NormalWeb"/>
-        <w:rPr>
-          <w:rFonts w:ascii="Segoe UI" w:hAnsi="Segoe UI" w:cs="Segoe UI"/>
-          <w:color w:val="1C2333"/>
-          <w:sz w:val="20"/>
-          <w:szCs w:val="20"/>
-          <w:lang w:val="es-ES"/>
-        </w:rPr>
-      </w:pPr>
-      <w:r>
-        <w:rPr>
-          <w:rFonts w:ascii="Segoe UI" w:hAnsi="Segoe UI" w:cs="Segoe UI"/>
-          <w:color w:val="1C2333"/>
-          <w:sz w:val="20"/>
-          <w:szCs w:val="20"/>
-          <w:lang w:val="es-ES"/>
-        </w:rPr>
-        <w:t xml:space="preserve">&gt; </w:t>
-      </w:r>
+        <w:shd w:val="clear" w:color="auto" w:fill="F7F8FA"/>
+        <w:spacing w:before="45" w:after="45"/>
+        <w:divId w:val="1754351498"/>
+        <w:rPr>
+          <w:rFonts w:ascii="Segoe UI" w:hAnsi="Segoe UI" w:cs="Segoe UI"/>
+          <w:color w:val="3A4456"/>
+          <w:sz w:val="20"/>
+          <w:szCs w:val="20"/>
+          <w:lang w:val="es-ES"/>
+        </w:rPr>
+      </w:pPr>
       <w:r>
         <w:rPr>
           <w:rStyle w:val="Fuerte"/>
@@ -52,12 +44,12 @@
       <w:r>
         <w:rPr>
           <w:rFonts w:ascii="Segoe UI" w:hAnsi="Segoe UI" w:cs="Segoe UI"/>
-          <w:color w:val="1C2333"/>
-          <w:sz w:val="20"/>
-          <w:szCs w:val="20"/>
-          <w:lang w:val="es-ES"/>
-        </w:rPr>
-        <w:t xml:space="preserve"> Versión ligera del viernes 11-sep-2026 por la &gt; tarde; sustituye a la versión larga del mismo día.</w:t>
+          <w:color w:val="3A4456"/>
+          <w:sz w:val="20"/>
+          <w:szCs w:val="20"/>
+          <w:lang w:val="es-ES"/>
+        </w:rPr>
+        <w:t xml:space="preserve"> Versión ligera del viernes 11-sep-2026 por la tarde; sustituye a la versión larga del mismo día.</w:t>
       </w:r>
     </w:p>
     <w:tbl>
@@ -100,9 +92,11 @@
           </w:tcPr>
           <w:p>
             <w:pPr>
+              <w:shd w:val="clear" w:color="auto" w:fill="F7F8FA"/>
+              <w:spacing w:before="45" w:after="45"/>
               <w:rPr>
                 <w:rFonts w:ascii="Segoe UI" w:hAnsi="Segoe UI" w:cs="Segoe UI"/>
-                <w:color w:val="1C2333"/>
+                <w:color w:val="3A4456"/>
                 <w:sz w:val="17"/>
                 <w:szCs w:val="20"/>
                 <w:lang w:val="es-ES"/>
@@ -403,7 +397,7 @@
           <w:szCs w:val="20"/>
           <w:lang w:val="es-ES"/>
         </w:rPr>
-        <w:pict w14:anchorId="0E57BFB8">
+        <w:pict w14:anchorId="7B259CC6">
           <v:rect id="_x0000_i1025" style="width:0;height:1.5pt" o:hralign="center" o:hrstd="t" o:hr="t" fillcolor="#a0a0a0" stroked="f"/>
         </w:pict>
       </w:r>
@@ -612,7 +606,7 @@
           <w:szCs w:val="20"/>
           <w:lang w:val="es-ES"/>
         </w:rPr>
-        <w:t>SATAG está en https://satag.asuncionqro.edu.mx desde el 10-sep (se publica con GitHub Actions por FTPS).</w:t>
+        <w:t xml:space="preserve">SATAG está en https://satag.asuncionqro.edu.mx desde el 10-sep (se publica con GitHub Actions por FTPS). </w:t>
       </w:r>
     </w:p>
     <w:p>
@@ -639,7 +633,7 @@
           <w:szCs w:val="20"/>
           <w:lang w:val="es-ES"/>
         </w:rPr>
-        <w:t>Cuentas con verificación en dos pasos: Zairet Ledezma (Administración); Lidia Segundo y Ángel Martínez (TI); Miguel González y Gerardo Sánchez (super).</w:t>
+        <w:t xml:space="preserve">Cuentas con verificación en dos pasos: Zairet Ledezma (Administración); Lidia Segundo y Ángel Martínez (TI); Miguel González y Gerardo Sánchez (super). </w:t>
       </w:r>
     </w:p>
     <w:p>
@@ -666,7 +660,7 @@
           <w:szCs w:val="20"/>
           <w:lang w:val="es-ES"/>
         </w:rPr>
-        <w:t>La verificación en dos pasos del CP Vicente está pendiente y no bloquea: nadie corta caja hasta que exista su rol de contador.</w:t>
+        <w:t xml:space="preserve">La verificación en dos pasos del CP Vicente está pendiente y no bloquea: nadie corta caja hasta que exista su rol de contador. </w:t>
       </w:r>
     </w:p>
     <w:p>
@@ -693,7 +687,7 @@
           <w:szCs w:val="20"/>
           <w:lang w:val="es-ES"/>
         </w:rPr>
-        <w:t>El padrón del piloto se limpió completo: lo que hay hoy en la base son pruebas del equipo.</w:t>
+        <w:t xml:space="preserve">El padrón del piloto se limpió completo: lo que hay hoy en la base son pruebas del equipo. </w:t>
       </w:r>
     </w:p>
     <w:p>
@@ -742,7 +736,7 @@
           <w:szCs w:val="20"/>
           <w:lang w:val="es-ES"/>
         </w:rPr>
-        <w:t>Dos apellidos obligatorios; uno solo, para extranjeros.</w:t>
+        <w:t xml:space="preserve">Dos apellidos obligatorios; uno solo, para extranjeros. </w:t>
       </w:r>
     </w:p>
     <w:p>
@@ -769,7 +763,7 @@
           <w:szCs w:val="20"/>
           <w:lang w:val="es-ES"/>
         </w:rPr>
-        <w:t>«Apellidos de la familia» obligatorios para padres, alumnos (incluido todo conductor menor de edad) y otros familiares, para que Administración coteje en GES.</w:t>
+        <w:t xml:space="preserve">«Apellidos de la familia» obligatorios para padres, alumnos (incluido todo conductor menor de edad) y otros familiares, para que Administración coteje en GES. </w:t>
       </w:r>
     </w:p>
     <w:p>
@@ -797,7 +791,7 @@
           <w:lang w:val="es-ES"/>
         </w:rPr>
         <w:lastRenderedPageBreak/>
-        <w:t>Tipo Otro familiar, con su parentesco escrito a mano, en el formulario y en el panel (bloques 63, 64 y 65). La ayuda del campo conserva sus ejemplos como guía para escribir: tío del alumno, abuela, primo.</w:t>
+        <w:t xml:space="preserve">Tipo Otro familiar, con su parentesco escrito a mano, en el formulario y en el panel (bloques 63, 64 y 65). La ayuda del campo conserva sus ejemplos como guía para escribir: tío del alumno, abuela, primo. </w:t>
       </w:r>
     </w:p>
     <w:p>
@@ -824,7 +818,7 @@
           <w:szCs w:val="20"/>
           <w:lang w:val="es-ES"/>
         </w:rPr>
-        <w:t>Las mismas placas no entran en dos expedientes vivos y se guardan en mayúsculas (bloque 62).</w:t>
+        <w:t xml:space="preserve">Las mismas placas no entran en dos expedientes vivos y se guardan en mayúsculas (bloque 62). </w:t>
       </w:r>
     </w:p>
     <w:p>
@@ -851,7 +845,7 @@
           <w:szCs w:val="20"/>
           <w:lang w:val="es-ES"/>
         </w:rPr>
-        <w:t>Catálogo al día: 45 marcas y 337 modelos, más la opción «Otro» (bloque 56).</w:t>
+        <w:t xml:space="preserve">Catálogo al día: 45 marcas y 337 modelos, más la opción «Otro» (bloque 56). </w:t>
       </w:r>
     </w:p>
     <w:p>
@@ -878,7 +872,7 @@
           <w:szCs w:val="20"/>
           <w:lang w:val="es-ES"/>
         </w:rPr>
-        <w:t>El aviso ya no se ve duplicado en el alta, y «Volver» desde el aviso regresa a /registro/.</w:t>
+        <w:t xml:space="preserve">El aviso ya no se ve duplicado en el alta, y «Volver» desde el aviso regresa a /registro/. </w:t>
       </w:r>
     </w:p>
     <w:p>
@@ -927,7 +921,7 @@
           <w:szCs w:val="20"/>
           <w:lang w:val="es-ES"/>
         </w:rPr>
-        <w:t>TI corrige placas, marca, modelo y color con el mismo catálogo del alta, con «Otro» para lo que no esté.</w:t>
+        <w:t xml:space="preserve">TI corrige placas, marca, modelo y color con el mismo catálogo del alta, con «Otro» para lo que no esté. </w:t>
       </w:r>
     </w:p>
     <w:p>
@@ -954,7 +948,7 @@
           <w:szCs w:val="20"/>
           <w:lang w:val="es-ES"/>
         </w:rPr>
-        <w:t>En celular: el diálogo de confirmación cabe en la pantalla, los campos tienen contraste y los botones son lo bastante grandes para tocarlos con el dedo, sin lupa.</w:t>
+        <w:t xml:space="preserve">En celular: el diálogo de confirmación cabe en la pantalla, los campos tienen contraste y los botones son lo bastante grandes para tocarlos con el dedo, sin lupa. </w:t>
       </w:r>
     </w:p>
     <w:p>
@@ -981,7 +975,7 @@
           <w:szCs w:val="20"/>
           <w:lang w:val="es-ES"/>
         </w:rPr>
-        <w:t>«Actualizar lista», buscador en «Instalar TAG» por placas, apellidos o nombre, el número de TAG en grande al confirmar, «Instalando el TAG…» mientras guarda y un mensaje que no invita a repetir a ciegas si se cae la red.</w:t>
+        <w:t xml:space="preserve">«Actualizar lista», buscador en «Instalar TAG» por placas, apellidos o nombre, el número de TAG en grande al confirmar, «Instalando el TAG…» mientras guarda y un mensaje que no invita a repetir a ciegas si se cae la red. </w:t>
       </w:r>
     </w:p>
     <w:p>
@@ -1008,7 +1002,7 @@
           <w:szCs w:val="20"/>
           <w:lang w:val="es-ES"/>
         </w:rPr>
-        <w:t>Cobro: confirma el tipo de usuario y el parentesco, y recuerda cotejar en GES con los apellidos de la familia a la vista.</w:t>
+        <w:t xml:space="preserve">Cobro: confirma el tipo de usuario y el parentesco, y recuerda cotejar en GES con los apellidos de la familia a la vista. </w:t>
       </w:r>
     </w:p>
     <w:p>
@@ -1045,7 +1039,7 @@
           <w:szCs w:val="20"/>
           <w:lang w:val="es-ES"/>
         </w:rPr>
-        <w:t xml:space="preserve"> Administración coteja a la familia en GES al cobrar; si la familia no aparece, no se recibe el pago ni se instala el TAG. TI no coteja en GES: instala a quien ya pagó.</w:t>
+        <w:t xml:space="preserve"> Administración coteja a la familia en GES al cobrar; si la familia no aparece, no se recibe el pago ni se instala el TAG. TI no coteja en GES: instala a quien ya pagó. </w:t>
       </w:r>
     </w:p>
     <w:p>
@@ -1072,7 +1066,7 @@
           <w:szCs w:val="20"/>
           <w:lang w:val="es-ES"/>
         </w:rPr>
-        <w:t>Exportación a ZKBioSecurity desde «TAGs de la escuela», con la plantilla oficial que ZK aceptó el 8-sep; el «Otro familiar» viaja en el departamento «Padres de familia».</w:t>
+        <w:t xml:space="preserve">Exportación a ZKBioSecurity desde «TAGs de la escuela», con la plantilla oficial que ZK aceptó el 8-sep; el «Otro familiar» viaja en el departamento «Padres de familia». </w:t>
       </w:r>
     </w:p>
     <w:p>
@@ -1141,7 +1135,7 @@
           <w:szCs w:val="20"/>
           <w:lang w:val="es-ES"/>
         </w:rPr>
-        <w:t>.</w:t>
+        <w:t xml:space="preserve">. </w:t>
       </w:r>
     </w:p>
     <w:p>
@@ -1168,7 +1162,7 @@
           <w:szCs w:val="20"/>
           <w:lang w:val="es-ES"/>
         </w:rPr>
-        <w:t>El documento del aviso para Legal ya está en Drive, documentado y listo para el lunes. Legal lo revisará después y lo modificará si hace falta; no se acordó una revisión previa. Si cambia algo, se publica una versión nueva y cada firma conserva la versión que aceptó.</w:t>
+        <w:t xml:space="preserve">El documento del aviso para Legal ya está en Drive, documentado y listo para el lunes. Legal lo revisará después y lo modificará si hace falta; no se acordó una revisión previa. Si cambia algo, se publica una versión nueva y cada firma conserva la versión que aceptó. </w:t>
       </w:r>
     </w:p>
     <w:p>
@@ -1195,7 +1189,7 @@
           <w:szCs w:val="20"/>
           <w:lang w:val="es-ES"/>
         </w:rPr>
-        <w:t>Reglamento: los comentarios ya se enviaron a Arturo; se espera el reglamento final.</w:t>
+        <w:t xml:space="preserve">Reglamento: los comentarios ya se enviaron a Arturo; se espera el reglamento final. </w:t>
       </w:r>
     </w:p>
     <w:p>
@@ -1244,7 +1238,7 @@
           <w:szCs w:val="20"/>
           <w:lang w:val="es-ES"/>
         </w:rPr>
-        <w:t>«E8 - Guía rápida para familias» y «E8 - Guía rápida del personal», en Word, al día con lo publicado hoy.</w:t>
+        <w:t xml:space="preserve">«E8 - Guía rápida para familias» y «E8 - Guía rápida del personal», en Word, al día con lo publicado hoy. </w:t>
       </w:r>
     </w:p>
     <w:p>
@@ -1271,30 +1265,22 @@
           <w:szCs w:val="20"/>
           <w:lang w:val="es-ES"/>
         </w:rPr>
-        <w:t>Falta llenar sus espacios en blanco e imprimirlas (sección 6).</w:t>
-      </w:r>
-    </w:p>
-    <w:p>
-      <w:pPr>
-        <w:pStyle w:val="NormalWeb"/>
-        <w:rPr>
-          <w:rFonts w:ascii="Segoe UI" w:hAnsi="Segoe UI" w:cs="Segoe UI"/>
-          <w:color w:val="1C2333"/>
-          <w:sz w:val="20"/>
-          <w:szCs w:val="20"/>
-          <w:lang w:val="es-ES"/>
-        </w:rPr>
-      </w:pPr>
-      <w:r>
-        <w:rPr>
-          <w:rFonts w:ascii="Segoe UI" w:hAnsi="Segoe UI" w:cs="Segoe UI"/>
-          <w:color w:val="1C2333"/>
-          <w:sz w:val="20"/>
-          <w:szCs w:val="20"/>
-          <w:lang w:val="es-ES"/>
-        </w:rPr>
-        <w:t xml:space="preserve">&gt; </w:t>
-      </w:r>
+        <w:t xml:space="preserve">Falta llenar sus espacios en blanco e imprimirlas (sección 6). </w:t>
+      </w:r>
+    </w:p>
+    <w:p>
+      <w:pPr>
+        <w:shd w:val="clear" w:color="auto" w:fill="F7F8FA"/>
+        <w:spacing w:before="45" w:after="45"/>
+        <w:divId w:val="1536963031"/>
+        <w:rPr>
+          <w:rFonts w:ascii="Segoe UI" w:hAnsi="Segoe UI" w:cs="Segoe UI"/>
+          <w:color w:val="3A4456"/>
+          <w:sz w:val="20"/>
+          <w:szCs w:val="20"/>
+          <w:lang w:val="es-ES"/>
+        </w:rPr>
+      </w:pPr>
       <w:r>
         <w:rPr>
           <w:rStyle w:val="Fuerte"/>
@@ -1308,7 +1294,7 @@
       <w:r>
         <w:rPr>
           <w:rFonts w:ascii="Segoe UI" w:hAnsi="Segoe UI" w:cs="Segoe UI"/>
-          <w:color w:val="1C2333"/>
+          <w:color w:val="3A4456"/>
           <w:sz w:val="20"/>
           <w:szCs w:val="20"/>
           <w:lang w:val="es-ES"/>
@@ -1318,7 +1304,7 @@
       <w:r>
         <w:rPr>
           <w:rStyle w:val="CdigoHTML"/>
-          <w:color w:val="1C2333"/>
+          <w:color w:val="3A4456"/>
           <w:lang w:val="es-ES"/>
         </w:rPr>
         <w:t>a464c4a</w:t>
@@ -1326,7 +1312,7 @@
       <w:r>
         <w:rPr>
           <w:rFonts w:ascii="Segoe UI" w:hAnsi="Segoe UI" w:cs="Segoe UI"/>
-          <w:color w:val="1C2333"/>
+          <w:color w:val="3A4456"/>
           <w:sz w:val="20"/>
           <w:szCs w:val="20"/>
           <w:lang w:val="es-ES"/>
@@ -1336,7 +1322,7 @@
       <w:r>
         <w:rPr>
           <w:rStyle w:val="CdigoHTML"/>
-          <w:color w:val="1C2333"/>
+          <w:color w:val="3A4456"/>
           <w:lang w:val="es-ES"/>
         </w:rPr>
         <w:t>b13af63</w:t>
@@ -1344,7 +1330,7 @@
       <w:r>
         <w:rPr>
           <w:rFonts w:ascii="Segoe UI" w:hAnsi="Segoe UI" w:cs="Segoe UI"/>
-          <w:color w:val="1C2333"/>
+          <w:color w:val="3A4456"/>
           <w:sz w:val="20"/>
           <w:szCs w:val="20"/>
           <w:lang w:val="es-ES"/>
@@ -1354,7 +1340,7 @@
       <w:r>
         <w:rPr>
           <w:rStyle w:val="CdigoHTML"/>
-          <w:color w:val="1C2333"/>
+          <w:color w:val="3A4456"/>
           <w:lang w:val="es-ES"/>
         </w:rPr>
         <w:t>0ef7841</w:t>
@@ -1362,7 +1348,7 @@
       <w:r>
         <w:rPr>
           <w:rFonts w:ascii="Segoe UI" w:hAnsi="Segoe UI" w:cs="Segoe UI"/>
-          <w:color w:val="1C2333"/>
+          <w:color w:val="3A4456"/>
           <w:sz w:val="20"/>
           <w:szCs w:val="20"/>
           <w:lang w:val="es-ES"/>
@@ -1372,7 +1358,7 @@
       <w:r>
         <w:rPr>
           <w:rStyle w:val="CdigoHTML"/>
-          <w:color w:val="1C2333"/>
+          <w:color w:val="3A4456"/>
           <w:lang w:val="es-ES"/>
         </w:rPr>
         <w:t>468fbce</w:t>
@@ -1380,7 +1366,7 @@
       <w:r>
         <w:rPr>
           <w:rFonts w:ascii="Segoe UI" w:hAnsi="Segoe UI" w:cs="Segoe UI"/>
-          <w:color w:val="1C2333"/>
+          <w:color w:val="3A4456"/>
           <w:sz w:val="20"/>
           <w:szCs w:val="20"/>
           <w:lang w:val="es-ES"/>
@@ -1390,7 +1376,7 @@
       <w:r>
         <w:rPr>
           <w:rStyle w:val="CdigoHTML"/>
-          <w:color w:val="1C2333"/>
+          <w:color w:val="3A4456"/>
           <w:lang w:val="es-ES"/>
         </w:rPr>
         <w:t>3ab2401</w:t>
@@ -1398,7 +1384,7 @@
       <w:r>
         <w:rPr>
           <w:rFonts w:ascii="Segoe UI" w:hAnsi="Segoe UI" w:cs="Segoe UI"/>
-          <w:color w:val="1C2333"/>
+          <w:color w:val="3A4456"/>
           <w:sz w:val="20"/>
           <w:szCs w:val="20"/>
           <w:lang w:val="es-ES"/>
@@ -1408,7 +1394,7 @@
       <w:r>
         <w:rPr>
           <w:rStyle w:val="CdigoHTML"/>
-          <w:color w:val="1C2333"/>
+          <w:color w:val="3A4456"/>
           <w:lang w:val="es-ES"/>
         </w:rPr>
         <w:t>d86cbb6</w:t>
@@ -1416,7 +1402,7 @@
       <w:r>
         <w:rPr>
           <w:rFonts w:ascii="Segoe UI" w:hAnsi="Segoe UI" w:cs="Segoe UI"/>
-          <w:color w:val="1C2333"/>
+          <w:color w:val="3A4456"/>
           <w:sz w:val="20"/>
           <w:szCs w:val="20"/>
           <w:lang w:val="es-ES"/>
@@ -1426,7 +1412,7 @@
       <w:r>
         <w:rPr>
           <w:rStyle w:val="CdigoHTML"/>
-          <w:color w:val="1C2333"/>
+          <w:color w:val="3A4456"/>
           <w:lang w:val="es-ES"/>
         </w:rPr>
         <w:t>a464c4a</w:t>
@@ -1434,7 +1420,7 @@
       <w:r>
         <w:rPr>
           <w:rFonts w:ascii="Segoe UI" w:hAnsi="Segoe UI" w:cs="Segoe UI"/>
-          <w:color w:val="1C2333"/>
+          <w:color w:val="3A4456"/>
           <w:sz w:val="20"/>
           <w:szCs w:val="20"/>
           <w:lang w:val="es-ES"/>
@@ -1444,7 +1430,7 @@
       <w:r>
         <w:rPr>
           <w:rStyle w:val="CdigoHTML"/>
-          <w:color w:val="1C2333"/>
+          <w:color w:val="3A4456"/>
           <w:lang w:val="es-ES"/>
         </w:rPr>
         <w:t>b521dce</w:t>
@@ -1452,7 +1438,7 @@
       <w:r>
         <w:rPr>
           <w:rFonts w:ascii="Segoe UI" w:hAnsi="Segoe UI" w:cs="Segoe UI"/>
-          <w:color w:val="1C2333"/>
+          <w:color w:val="3A4456"/>
           <w:sz w:val="20"/>
           <w:szCs w:val="20"/>
           <w:lang w:val="es-ES"/>
@@ -1533,7 +1519,7 @@
           <w:szCs w:val="20"/>
           <w:lang w:val="es-ES"/>
         </w:rPr>
-        <w:t xml:space="preserve"> (Zairet, en el dominio). El perfil super se salta la revisión de permisos, así que no prueba los de nadie más.</w:t>
+        <w:t xml:space="preserve"> (Zairet, en el dominio). El perfil super se salta la revisión de permisos, así que no prueba los de nadie más. </w:t>
       </w:r>
     </w:p>
     <w:p>
@@ -1570,7 +1556,7 @@
           <w:szCs w:val="20"/>
           <w:lang w:val="es-ES"/>
         </w:rPr>
-        <w:t xml:space="preserve"> (Lidia o Ángel), que es donde se va a instalar.</w:t>
+        <w:t xml:space="preserve"> (Lidia o Ángel), que es donde se va a instalar. </w:t>
       </w:r>
     </w:p>
     <w:p>
@@ -1617,7 +1603,7 @@
           <w:szCs w:val="20"/>
           <w:lang w:val="es-ES"/>
         </w:rPr>
-        <w:t>alta con parentesco, cobro con confirmación del parentesco e instalación.</w:t>
+        <w:t xml:space="preserve">alta con parentesco, cobro con confirmación del parentesco e instalación. </w:t>
       </w:r>
     </w:p>
     <w:p>
@@ -1654,7 +1640,7 @@
           <w:szCs w:val="20"/>
           <w:lang w:val="es-ES"/>
         </w:rPr>
-        <w:t>, con varios expedientes en la cola.</w:t>
+        <w:t xml:space="preserve">, con varios expedientes en la cola. </w:t>
       </w:r>
     </w:p>
     <w:p>
@@ -1691,7 +1677,7 @@
           <w:szCs w:val="20"/>
           <w:lang w:val="es-ES"/>
         </w:rPr>
-        <w:t>, revisando que cada tipo caiga en su departamento.</w:t>
+        <w:t xml:space="preserve">, revisando que cada tipo caiga en su departamento. </w:t>
       </w:r>
     </w:p>
     <w:p>
@@ -1728,7 +1714,7 @@
           <w:szCs w:val="20"/>
           <w:lang w:val="es-ES"/>
         </w:rPr>
-        <w:t xml:space="preserve"> que quede a nombre de quien firma por él, no del menor.</w:t>
+        <w:t xml:space="preserve"> que quede a nombre de quien firma por él, no del menor. </w:t>
       </w:r>
     </w:p>
     <w:p>
@@ -1765,7 +1751,7 @@
           <w:szCs w:val="20"/>
           <w:lang w:val="es-ES"/>
         </w:rPr>
-        <w:t>, sin marcar «menor de edad»: que también pida los apellidos de la familia.</w:t>
+        <w:t xml:space="preserve">, sin marcar «menor de edad»: que también pida los apellidos de la familia. </w:t>
       </w:r>
     </w:p>
     <w:p>
@@ -1858,10 +1844,10 @@
         <w:tblLook w:val="04A0" w:firstRow="1" w:lastRow="0" w:firstColumn="1" w:lastColumn="0" w:noHBand="0" w:noVBand="1"/>
       </w:tblPr>
       <w:tblGrid>
-        <w:gridCol w:w="975"/>
-        <w:gridCol w:w="3694"/>
-        <w:gridCol w:w="2428"/>
-        <w:gridCol w:w="2887"/>
+        <w:gridCol w:w="2496"/>
+        <w:gridCol w:w="2496"/>
+        <w:gridCol w:w="2496"/>
+        <w:gridCol w:w="2496"/>
       </w:tblGrid>
       <w:tr>
         <w:trPr>
@@ -1870,7 +1856,7 @@
         </w:trPr>
         <w:tc>
           <w:tcPr>
-            <w:tcW w:w="488" w:type="pct"/>
+            <w:tcW w:w="1250" w:type="pct"/>
             <w:tcBorders>
               <w:top w:val="single" w:sz="6" w:space="0" w:color="CFD6E0"/>
               <w:left w:val="single" w:sz="6" w:space="0" w:color="CFD6E0"/>
@@ -1913,7 +1899,7 @@
         </w:tc>
         <w:tc>
           <w:tcPr>
-            <w:tcW w:w="1850" w:type="pct"/>
+            <w:tcW w:w="1250" w:type="pct"/>
             <w:tcBorders>
               <w:top w:val="single" w:sz="6" w:space="0" w:color="CFD6E0"/>
               <w:left w:val="single" w:sz="6" w:space="0" w:color="CFD6E0"/>
@@ -1956,7 +1942,7 @@
         </w:tc>
         <w:tc>
           <w:tcPr>
-            <w:tcW w:w="1216" w:type="pct"/>
+            <w:tcW w:w="1250" w:type="pct"/>
             <w:tcBorders>
               <w:top w:val="single" w:sz="6" w:space="0" w:color="CFD6E0"/>
               <w:left w:val="single" w:sz="6" w:space="0" w:color="CFD6E0"/>
@@ -1999,7 +1985,7 @@
         </w:tc>
         <w:tc>
           <w:tcPr>
-            <w:tcW w:w="1446" w:type="pct"/>
+            <w:tcW w:w="1250" w:type="pct"/>
             <w:tcBorders>
               <w:top w:val="single" w:sz="6" w:space="0" w:color="CFD6E0"/>
               <w:left w:val="single" w:sz="6" w:space="0" w:color="CFD6E0"/>
@@ -2047,7 +2033,7 @@
         </w:trPr>
         <w:tc>
           <w:tcPr>
-            <w:tcW w:w="488" w:type="pct"/>
+            <w:tcW w:w="1250" w:type="pct"/>
             <w:tcBorders>
               <w:top w:val="single" w:sz="6" w:space="0" w:color="CFD6E0"/>
               <w:left w:val="single" w:sz="6" w:space="0" w:color="CFD6E0"/>
@@ -2085,7 +2071,7 @@
         </w:tc>
         <w:tc>
           <w:tcPr>
-            <w:tcW w:w="1850" w:type="pct"/>
+            <w:tcW w:w="1250" w:type="pct"/>
             <w:tcBorders>
               <w:top w:val="single" w:sz="6" w:space="0" w:color="CFD6E0"/>
               <w:left w:val="single" w:sz="6" w:space="0" w:color="CFD6E0"/>
@@ -2123,7 +2109,7 @@
         </w:tc>
         <w:tc>
           <w:tcPr>
-            <w:tcW w:w="1216" w:type="pct"/>
+            <w:tcW w:w="1250" w:type="pct"/>
             <w:tcBorders>
               <w:top w:val="single" w:sz="6" w:space="0" w:color="CFD6E0"/>
               <w:left w:val="single" w:sz="6" w:space="0" w:color="CFD6E0"/>
@@ -2161,7 +2147,7 @@
         </w:tc>
         <w:tc>
           <w:tcPr>
-            <w:tcW w:w="1446" w:type="pct"/>
+            <w:tcW w:w="1250" w:type="pct"/>
             <w:tcBorders>
               <w:top w:val="single" w:sz="6" w:space="0" w:color="CFD6E0"/>
               <w:left w:val="single" w:sz="6" w:space="0" w:color="CFD6E0"/>
@@ -2204,7 +2190,7 @@
         </w:trPr>
         <w:tc>
           <w:tcPr>
-            <w:tcW w:w="488" w:type="pct"/>
+            <w:tcW w:w="1250" w:type="pct"/>
             <w:tcBorders>
               <w:top w:val="single" w:sz="6" w:space="0" w:color="CFD6E0"/>
               <w:left w:val="single" w:sz="6" w:space="0" w:color="CFD6E0"/>
@@ -2242,7 +2228,7 @@
         </w:tc>
         <w:tc>
           <w:tcPr>
-            <w:tcW w:w="1850" w:type="pct"/>
+            <w:tcW w:w="1250" w:type="pct"/>
             <w:tcBorders>
               <w:top w:val="single" w:sz="6" w:space="0" w:color="CFD6E0"/>
               <w:left w:val="single" w:sz="6" w:space="0" w:color="CFD6E0"/>
@@ -2280,7 +2266,7 @@
         </w:tc>
         <w:tc>
           <w:tcPr>
-            <w:tcW w:w="1216" w:type="pct"/>
+            <w:tcW w:w="1250" w:type="pct"/>
             <w:tcBorders>
               <w:top w:val="single" w:sz="6" w:space="0" w:color="CFD6E0"/>
               <w:left w:val="single" w:sz="6" w:space="0" w:color="CFD6E0"/>
@@ -2318,7 +2304,7 @@
         </w:tc>
         <w:tc>
           <w:tcPr>
-            <w:tcW w:w="1446" w:type="pct"/>
+            <w:tcW w:w="1250" w:type="pct"/>
             <w:tcBorders>
               <w:top w:val="single" w:sz="6" w:space="0" w:color="CFD6E0"/>
               <w:left w:val="single" w:sz="6" w:space="0" w:color="CFD6E0"/>
@@ -2361,7 +2347,7 @@
         </w:trPr>
         <w:tc>
           <w:tcPr>
-            <w:tcW w:w="488" w:type="pct"/>
+            <w:tcW w:w="1250" w:type="pct"/>
             <w:tcBorders>
               <w:top w:val="single" w:sz="6" w:space="0" w:color="CFD6E0"/>
               <w:left w:val="single" w:sz="6" w:space="0" w:color="CFD6E0"/>
@@ -2399,7 +2385,7 @@
         </w:tc>
         <w:tc>
           <w:tcPr>
-            <w:tcW w:w="1850" w:type="pct"/>
+            <w:tcW w:w="1250" w:type="pct"/>
             <w:tcBorders>
               <w:top w:val="single" w:sz="6" w:space="0" w:color="CFD6E0"/>
               <w:left w:val="single" w:sz="6" w:space="0" w:color="CFD6E0"/>
@@ -2437,7 +2423,7 @@
         </w:tc>
         <w:tc>
           <w:tcPr>
-            <w:tcW w:w="1216" w:type="pct"/>
+            <w:tcW w:w="1250" w:type="pct"/>
             <w:tcBorders>
               <w:top w:val="single" w:sz="6" w:space="0" w:color="CFD6E0"/>
               <w:left w:val="single" w:sz="6" w:space="0" w:color="CFD6E0"/>
@@ -2475,7 +2461,7 @@
         </w:tc>
         <w:tc>
           <w:tcPr>
-            <w:tcW w:w="1446" w:type="pct"/>
+            <w:tcW w:w="1250" w:type="pct"/>
             <w:tcBorders>
               <w:top w:val="single" w:sz="6" w:space="0" w:color="CFD6E0"/>
               <w:left w:val="single" w:sz="6" w:space="0" w:color="CFD6E0"/>
@@ -2518,7 +2504,7 @@
         </w:trPr>
         <w:tc>
           <w:tcPr>
-            <w:tcW w:w="488" w:type="pct"/>
+            <w:tcW w:w="1250" w:type="pct"/>
             <w:tcBorders>
               <w:top w:val="single" w:sz="6" w:space="0" w:color="CFD6E0"/>
               <w:left w:val="single" w:sz="6" w:space="0" w:color="CFD6E0"/>
@@ -2556,7 +2542,7 @@
         </w:tc>
         <w:tc>
           <w:tcPr>
-            <w:tcW w:w="1850" w:type="pct"/>
+            <w:tcW w:w="1250" w:type="pct"/>
             <w:tcBorders>
               <w:top w:val="single" w:sz="6" w:space="0" w:color="CFD6E0"/>
               <w:left w:val="single" w:sz="6" w:space="0" w:color="CFD6E0"/>
@@ -2594,7 +2580,7 @@
         </w:tc>
         <w:tc>
           <w:tcPr>
-            <w:tcW w:w="1216" w:type="pct"/>
+            <w:tcW w:w="1250" w:type="pct"/>
             <w:tcBorders>
               <w:top w:val="single" w:sz="6" w:space="0" w:color="CFD6E0"/>
               <w:left w:val="single" w:sz="6" w:space="0" w:color="CFD6E0"/>
@@ -2632,7 +2618,7 @@
         </w:tc>
         <w:tc>
           <w:tcPr>
-            <w:tcW w:w="1446" w:type="pct"/>
+            <w:tcW w:w="1250" w:type="pct"/>
             <w:tcBorders>
               <w:top w:val="single" w:sz="6" w:space="0" w:color="CFD6E0"/>
               <w:left w:val="single" w:sz="6" w:space="0" w:color="CFD6E0"/>
@@ -2675,7 +2661,7 @@
         </w:trPr>
         <w:tc>
           <w:tcPr>
-            <w:tcW w:w="488" w:type="pct"/>
+            <w:tcW w:w="1250" w:type="pct"/>
             <w:tcBorders>
               <w:top w:val="single" w:sz="6" w:space="0" w:color="CFD6E0"/>
               <w:left w:val="single" w:sz="6" w:space="0" w:color="CFD6E0"/>
@@ -2713,7 +2699,7 @@
         </w:tc>
         <w:tc>
           <w:tcPr>
-            <w:tcW w:w="1850" w:type="pct"/>
+            <w:tcW w:w="1250" w:type="pct"/>
             <w:tcBorders>
               <w:top w:val="single" w:sz="6" w:space="0" w:color="CFD6E0"/>
               <w:left w:val="single" w:sz="6" w:space="0" w:color="CFD6E0"/>
@@ -2751,7 +2737,7 @@
         </w:tc>
         <w:tc>
           <w:tcPr>
-            <w:tcW w:w="1216" w:type="pct"/>
+            <w:tcW w:w="1250" w:type="pct"/>
             <w:tcBorders>
               <w:top w:val="single" w:sz="6" w:space="0" w:color="CFD6E0"/>
               <w:left w:val="single" w:sz="6" w:space="0" w:color="CFD6E0"/>
@@ -2789,7 +2775,7 @@
         </w:tc>
         <w:tc>
           <w:tcPr>
-            <w:tcW w:w="1446" w:type="pct"/>
+            <w:tcW w:w="1250" w:type="pct"/>
             <w:tcBorders>
               <w:top w:val="single" w:sz="6" w:space="0" w:color="CFD6E0"/>
               <w:left w:val="single" w:sz="6" w:space="0" w:color="CFD6E0"/>
@@ -2985,6 +2971,16 @@
         </w:rPr>
         <w:t>No lo dé por hecho.</w:t>
       </w:r>
+      <w:r>
+        <w:rPr>
+          <w:rFonts w:ascii="Segoe UI" w:eastAsia="Times New Roman" w:hAnsi="Segoe UI" w:cs="Segoe UI"/>
+          <w:color w:val="1C2333"/>
+          <w:sz w:val="20"/>
+          <w:szCs w:val="20"/>
+          <w:lang w:val="es-ES"/>
+        </w:rPr>
+        <w:t xml:space="preserve"> </w:t>
+      </w:r>
     </w:p>
     <w:p>
       <w:pPr>
@@ -3010,7 +3006,6 @@
           <w:szCs w:val="20"/>
           <w:lang w:val="es-ES"/>
         </w:rPr>
-        <w:lastRenderedPageBreak/>
         <w:t xml:space="preserve">Corra el PASO 1 de </w:t>
       </w:r>
       <w:r>
@@ -3047,7 +3042,7 @@
           <w:szCs w:val="20"/>
           <w:lang w:val="es-ES"/>
         </w:rPr>
-        <w:t>, fuera del repositorio, porque son datos personales.</w:t>
+        <w:t xml:space="preserve">, fuera del repositorio, porque son datos personales. </w:t>
       </w:r>
     </w:p>
     <w:p>
@@ -3086,6 +3081,16 @@
         </w:rPr>
         <w:t>No hay vuelta atrás.</w:t>
       </w:r>
+      <w:r>
+        <w:rPr>
+          <w:rFonts w:ascii="Segoe UI" w:eastAsia="Times New Roman" w:hAnsi="Segoe UI" w:cs="Segoe UI"/>
+          <w:color w:val="1C2333"/>
+          <w:sz w:val="20"/>
+          <w:szCs w:val="20"/>
+          <w:lang w:val="es-ES"/>
+        </w:rPr>
+        <w:t xml:space="preserve"> </w:t>
+      </w:r>
     </w:p>
     <w:p>
       <w:pPr>
@@ -3175,7 +3180,7 @@
           <w:szCs w:val="20"/>
           <w:lang w:val="es-ES"/>
         </w:rPr>
-        <w:t>Los TAGs dados de alta en el inventario; los que se usaron en las pruebas quedan otra vez disponibles.</w:t>
+        <w:t xml:space="preserve">Los TAGs dados de alta en el inventario; los que se usaron en las pruebas quedan otra vez disponibles. </w:t>
       </w:r>
     </w:p>
     <w:p>
@@ -3202,7 +3207,7 @@
           <w:szCs w:val="20"/>
           <w:lang w:val="es-ES"/>
         </w:rPr>
-        <w:t>Los catálogos: marcas, modelos, colores y estacionamientos.</w:t>
+        <w:t xml:space="preserve">Los catálogos: marcas, modelos, colores y estacionamientos. </w:t>
       </w:r>
     </w:p>
     <w:p>
@@ -3229,7 +3234,7 @@
           <w:szCs w:val="20"/>
           <w:lang w:val="es-ES"/>
         </w:rPr>
-        <w:t>Las versiones del aviso de privacidad y del reglamento.</w:t>
+        <w:t xml:space="preserve">Las versiones del aviso de privacidad y del reglamento. </w:t>
       </w:r>
     </w:p>
     <w:p>
@@ -3256,7 +3261,7 @@
           <w:szCs w:val="20"/>
           <w:lang w:val="es-ES"/>
         </w:rPr>
-        <w:t>Las cuentas del personal, con sus roles y su verificación en dos pasos.</w:t>
+        <w:t xml:space="preserve">Las cuentas del personal, con sus roles y su verificación en dos pasos. </w:t>
       </w:r>
     </w:p>
     <w:p>
@@ -3283,7 +3288,7 @@
           <w:szCs w:val="20"/>
           <w:lang w:val="es-ES"/>
         </w:rPr>
-        <w:t>El mapa de IDs de ZK (bloque 54) se conserva: la limpieza no lo toca. Se comprueba viendo que «TAGs de la escuela» siga mostrando el mapa con su fecha de carga.</w:t>
+        <w:t xml:space="preserve">El mapa de IDs de ZK (bloque 54) se conserva: la limpieza no lo toca. Se comprueba viendo que «TAGs de la escuela» siga mostrando el mapa con su fecha de carga. </w:t>
       </w:r>
     </w:p>
     <w:p>
@@ -3556,7 +3561,7 @@
           <w:szCs w:val="20"/>
           <w:lang w:val="es-ES"/>
         </w:rPr>
-        <w:t>, no solo sin capturar después.</w:t>
+        <w:t xml:space="preserve">, no solo sin capturar después. </w:t>
       </w:r>
     </w:p>
     <w:p>
@@ -3603,7 +3608,7 @@
           <w:szCs w:val="20"/>
           <w:lang w:val="es-ES"/>
         </w:rPr>
-        <w:t>y confirme uno por uno que todos son del equipo (los del apellido «Prueba»). Si aparece un alta ajena, deténgase y consulte.</w:t>
+        <w:t xml:space="preserve">y confirme uno por uno que todos son del equipo (los del apellido «Prueba»). Si aparece un alta ajena, deténgase y consulte. </w:t>
       </w:r>
     </w:p>
     <w:p>
@@ -3650,7 +3655,7 @@
           <w:szCs w:val="20"/>
           <w:lang w:val="es-ES"/>
         </w:rPr>
-        <w:t>; sin ella aborta sin tocar nada.</w:t>
+        <w:t xml:space="preserve">; sin ella aborta sin tocar nada. </w:t>
       </w:r>
     </w:p>
     <w:p>
@@ -3697,7 +3702,7 @@
           <w:szCs w:val="20"/>
           <w:lang w:val="es-ES"/>
         </w:rPr>
-        <w:t>vaciando el bucket desde el tablero de Supabase (PASO 3), no con SQL. Antes de vaciarlo, anote cuántas imágenes hay y a qué hora se subieron (la consulta del propio PASO 3 las lista): las altas que se rechazaron durante los incidentes del viernes dejaron ahí su firma, y es la única huella de que esas familias lo intentaron. Ese conteo va a la sección 9.</w:t>
+        <w:t xml:space="preserve">vaciando el bucket desde el tablero de Supabase (PASO 3), no con SQL. Antes de vaciarlo, anote cuántas imágenes hay y a qué hora se subieron (la consulta del propio PASO 3 las lista): las altas que se rechazaron durante los incidentes del viernes dejaron ahí su firma, y es la única huella de que esas familias lo intentaron. Ese conteo va a la sección 9. </w:t>
       </w:r>
     </w:p>
     <w:p>
@@ -3756,8 +3761,7 @@
           <w:szCs w:val="20"/>
           <w:lang w:val="es-ES"/>
         </w:rPr>
-        <w:lastRenderedPageBreak/>
-        <w:t>Antes de correrla, anote cuántos TAGs disponibles marca «TAGs de la escuela» (en el botón «Descargar plantilla ZK»). Después el número debe ser igual o mayor, nunca menor.</w:t>
+        <w:t xml:space="preserve">Antes de correrla, anote cuántos TAGs disponibles marca «TAGs de la escuela» (en el botón «Descargar plantilla ZK»). Después el número debe ser igual o mayor, nunca menor. </w:t>
       </w:r>
     </w:p>
     <w:p>
@@ -3784,7 +3788,7 @@
           <w:szCs w:val="20"/>
           <w:lang w:val="es-ES"/>
         </w:rPr>
-        <w:t>Al terminar: «Padrón completo» vacío y «En caja ahora» en ceros.</w:t>
+        <w:t xml:space="preserve">Al terminar: «Padrón completo» vacío y «En caja ahora» en ceros. </w:t>
       </w:r>
     </w:p>
     <w:p>
@@ -3811,7 +3815,7 @@
           <w:szCs w:val="20"/>
           <w:lang w:val="es-ES"/>
         </w:rPr>
-        <w:t>Que las secuencias quedaron reiniciadas (el PASO 2 del script lo imprime).</w:t>
+        <w:t xml:space="preserve">Que las secuencias quedaron reiniciadas (el PASO 2 del script lo imprime). </w:t>
       </w:r>
     </w:p>
     <w:p>
@@ -3838,7 +3842,7 @@
           <w:szCs w:val="20"/>
           <w:lang w:val="es-ES"/>
         </w:rPr>
-        <w:t>/registro/ carga los catálogos y el aviso v6 (sin enviar nada), y cada quien sigue entrando al panel.</w:t>
+        <w:t xml:space="preserve">/registro/ carga los catálogos y el aviso v6 (sin enviar nada), y cada quien sigue entrando al panel. </w:t>
       </w:r>
     </w:p>
     <w:p>
@@ -3943,7 +3947,7 @@
           <w:szCs w:val="20"/>
           <w:lang w:val="es-ES"/>
         </w:rPr>
-        <w:t>, cada quien con su cuenta. Es lo único que no se puede recuperar el fin de semana.</w:t>
+        <w:t xml:space="preserve">, cada quien con su cuenta. Es lo único que no se puede recuperar el fin de semana. </w:t>
       </w:r>
     </w:p>
     <w:p>
@@ -3970,7 +3974,7 @@
           <w:szCs w:val="20"/>
           <w:lang w:val="es-ES"/>
         </w:rPr>
-        <w:t>Confirmar con Miguel la salida del lunes y los riesgos de la sección 8; avisar a Zairet, Lidia, Ángel y el CP Vicente.</w:t>
+        <w:t xml:space="preserve">Confirmar con Miguel la salida del lunes y los riesgos de la sección 8; avisar a Zairet, Lidia, Ángel y el CP Vicente. </w:t>
       </w:r>
     </w:p>
     <w:p>
@@ -4019,7 +4023,7 @@
           <w:szCs w:val="20"/>
           <w:lang w:val="es-ES"/>
         </w:rPr>
-        <w:t>Llenar los seis espacios «[PENDIENTE]» de la guía del personal: teléfonos y horario de guardia, el criterio de Miguel para los estacionamientos de padres, maestros y otros familiares, quién exporta a ZK y cada cuándo, y los horarios de Administración y de instalación en la guía para familias.</w:t>
+        <w:t xml:space="preserve">Llenar los seis espacios «[PENDIENTE]» de la guía del personal: teléfonos y horario de guardia, el criterio de Miguel para los estacionamientos de padres, maestros y otros familiares, quién exporta a ZK y cada cuándo, y los horarios de Administración y de instalación en la guía para familias. </w:t>
       </w:r>
     </w:p>
     <w:p>
@@ -4046,7 +4050,7 @@
           <w:szCs w:val="20"/>
           <w:lang w:val="es-ES"/>
         </w:rPr>
-        <w:t>Imprimir las dos guías.</w:t>
+        <w:t xml:space="preserve">Imprimir las dos guías. </w:t>
       </w:r>
     </w:p>
     <w:p>
@@ -4103,7 +4107,7 @@
           <w:szCs w:val="20"/>
           <w:lang w:val="es-ES"/>
         </w:rPr>
-        <w:t xml:space="preserve"> (sección 5).</w:t>
+        <w:t xml:space="preserve"> (sección 5). </w:t>
       </w:r>
     </w:p>
     <w:p>
@@ -4130,7 +4134,7 @@
           <w:szCs w:val="20"/>
           <w:lang w:val="es-ES"/>
         </w:rPr>
-        <w:t>Regenerar «08 - Go-no-go 11-sep y verificacion final.docx» desde este documento y enviárselo a Miguel: el Word que hay en la carpeta es la versión larga de las 14:56 y no es la buena.</w:t>
+        <w:t xml:space="preserve">Regenerar «08 - Go-no-go 11-sep y verificacion final.docx» desde este documento y enviárselo a Miguel: el Word que hay en la carpeta es la versión larga de las 14:56 y no es la buena. </w:t>
       </w:r>
     </w:p>
     <w:p>
@@ -4179,7 +4183,7 @@
           <w:szCs w:val="20"/>
           <w:lang w:val="es-ES"/>
         </w:rPr>
-        <w:t>Terminar las pruebas que falten (registro, buzón, exportación a ZK, actualizar y dar de baja).</w:t>
+        <w:t xml:space="preserve">Terminar las pruebas que falten (registro, buzón, exportación a ZK, actualizar y dar de baja). </w:t>
       </w:r>
     </w:p>
     <w:p>
@@ -4206,7 +4210,7 @@
           <w:szCs w:val="20"/>
           <w:lang w:val="es-ES"/>
         </w:rPr>
-        <w:t>Correr la limpieza con su copia previa, borrar a mano las firmas del almacenamiento y hacer la comprobación rápida.</w:t>
+        <w:t xml:space="preserve">Correr la limpieza con su copia previa, borrar a mano las firmas del almacenamiento y hacer la comprobación rápida. </w:t>
       </w:r>
     </w:p>
     <w:p>
@@ -4233,7 +4237,7 @@
           <w:szCs w:val="20"/>
           <w:lang w:val="es-ES"/>
         </w:rPr>
-        <w:t>Desde ese momento, nadie da altas ni cobra en el sistema hasta el lunes, y el cartel sigue sin colocarse.</w:t>
+        <w:t xml:space="preserve">Desde ese momento, nadie da altas ni cobra en el sistema hasta el lunes, y el cartel sigue sin colocarse. </w:t>
       </w:r>
     </w:p>
     <w:p>
@@ -4292,7 +4296,7 @@
           <w:szCs w:val="20"/>
           <w:lang w:val="es-ES"/>
         </w:rPr>
-        <w:t xml:space="preserve"> Gerardo revisa que Supabase esté activo (si el proyecto aparece en pausa, lo reanuda desde el tablero) y que el panel y /registro/ abran, sin enviar nada.</w:t>
+        <w:t xml:space="preserve"> Gerardo revisa que Supabase esté activo (si el proyecto aparece en pausa, lo reanuda desde el tablero) y que el panel y /registro/ abran, sin enviar nada. </w:t>
       </w:r>
     </w:p>
     <w:p>
@@ -4339,7 +4343,7 @@
           <w:szCs w:val="20"/>
           <w:lang w:val="es-ES"/>
         </w:rPr>
-        <w:t>Gerardo en sitio lunes y martes, con los teléfonos de la guía del personal. Cada hallazgo va a la bitácora del día y se investiga ese mismo día, porque la cuenta gratuita de Supabase guarda los registros solo un día.</w:t>
+        <w:t xml:space="preserve">Gerardo en sitio lunes y martes, con los teléfonos de la guía del personal. Cada hallazgo va a la bitácora del día y se investiga ese mismo día, porque la cuenta gratuita de Supabase guarda los registros solo un día. </w:t>
       </w:r>
     </w:p>
     <w:p>
@@ -4386,7 +4390,7 @@
           <w:szCs w:val="20"/>
           <w:lang w:val="es-ES"/>
         </w:rPr>
-        <w:t>no se repite un cobro ni una instalación hasta ver si ya quedó, y nada de lo capturado se borra. Si el sitio o la base no responden y no se arregla en la mañana, ese día se atiende con el proceso en papel (papel, hoja de cálculo y ZK) que el personal conoce desde el 31-ago; volver atrás lo decide Miguel con lo que reporte Gerardo.</w:t>
+        <w:t xml:space="preserve">no se repite un cobro ni una instalación hasta ver si ya quedó, y nada de lo capturado se borra. Si el sitio o la base no responden y no se arregla en la mañana, ese día se atiende con el proceso en papel (papel, hoja de cálculo y ZK) que el personal conoce desde el 31-ago; volver atrás lo decide Miguel con lo que reporte Gerardo. </w:t>
       </w:r>
     </w:p>
     <w:p>
@@ -4413,7 +4417,6 @@
           <w:szCs w:val="20"/>
           <w:lang w:val="es-ES"/>
         </w:rPr>
-        <w:lastRenderedPageBreak/>
         <w:t>Si hubiera que deshacer un cambio del alta, primero se regresa la regla de la base y después el código, nunca al revés:</w:t>
       </w:r>
       <w:r>
@@ -4424,7 +4427,7 @@
           <w:szCs w:val="20"/>
           <w:lang w:val="es-ES"/>
         </w:rPr>
-        <w:t xml:space="preserve"> al revés se repite exactamente el incidente del viernes.</w:t>
+        <w:t xml:space="preserve"> al revés se repite exactamente el incidente del viernes. </w:t>
       </w:r>
     </w:p>
     <w:p>
@@ -4461,7 +4464,7 @@
           <w:szCs w:val="20"/>
           <w:lang w:val="es-ES"/>
         </w:rPr>
-        <w:t xml:space="preserve"> no es un interruptor. Su dirección está sin confirmar y sin probar con verificación en dos pasos, y no se alcanza quitando el proxy de Cloudflare (el registro apunta al hosting de GoDaddy y sin proxy el certificado queda inválido). Usarla exigiría un cambio de DNS que decide Miguel; mientras tanto, la caída se atiende en papel.</w:t>
+        <w:t xml:space="preserve"> no es un interruptor. Su dirección está sin confirmar y sin probar con verificación en dos pasos, y no se alcanza quitando el proxy de Cloudflare (el registro apunta al hosting de GoDaddy y sin proxy el certificado queda inválido). Usarla exigiría un cambio de DNS que decide Miguel; mientras tanto, la caída se atiende en papel. </w:t>
       </w:r>
     </w:p>
     <w:p>
@@ -4510,7 +4513,7 @@
           <w:szCs w:val="20"/>
           <w:lang w:val="es-ES"/>
         </w:rPr>
-        <w:t>Rol contador, único que corta caja, con su tablero (y la verificación en dos pasos del CP Vicente).</w:t>
+        <w:t xml:space="preserve">Rol contador, único que corta caja, con su tablero (y la verificación en dos pasos del CP Vicente). </w:t>
       </w:r>
     </w:p>
     <w:p>
@@ -4537,7 +4540,7 @@
           <w:szCs w:val="20"/>
           <w:lang w:val="es-ES"/>
         </w:rPr>
-        <w:t>Firma manuscrita visible solo para TI y contador.</w:t>
+        <w:t xml:space="preserve">Firma manuscrita visible solo para TI y contador. </w:t>
       </w:r>
     </w:p>
     <w:p>
@@ -4564,7 +4567,7 @@
           <w:szCs w:val="20"/>
           <w:lang w:val="es-ES"/>
         </w:rPr>
-        <w:t>Hora e identidad de quien instala, tomadas de su sesión.</w:t>
+        <w:t xml:space="preserve">Hora e identidad de quien instala, tomadas de su sesión. </w:t>
       </w:r>
     </w:p>
     <w:p>
@@ -4591,7 +4594,7 @@
           <w:szCs w:val="20"/>
           <w:lang w:val="es-ES"/>
         </w:rPr>
-        <w:t>Catálogo con el histórico de la hoja de cálculo.</w:t>
+        <w:t xml:space="preserve">Catálogo con el histórico de la hoja de cálculo. </w:t>
       </w:r>
     </w:p>
     <w:p>
@@ -4618,7 +4621,7 @@
           <w:szCs w:val="20"/>
           <w:lang w:val="es-ES"/>
         </w:rPr>
-        <w:t>Conciliar los manuales largos con el panel de hoy.</w:t>
+        <w:t xml:space="preserve">Conciliar los manuales largos con el panel de hoy. </w:t>
       </w:r>
     </w:p>
     <w:p>
@@ -4645,7 +4648,7 @@
           <w:szCs w:val="20"/>
           <w:lang w:val="es-ES"/>
         </w:rPr>
-        <w:t>Recuperar el comprobante desde el panel.</w:t>
+        <w:t xml:space="preserve">Recuperar el comprobante desde el panel. </w:t>
       </w:r>
     </w:p>
     <w:p>
@@ -4672,7 +4675,7 @@
           <w:szCs w:val="20"/>
           <w:lang w:val="es-ES"/>
         </w:rPr>
-        <w:t>Capturar los apellidos de la familia desde el panel.</w:t>
+        <w:t xml:space="preserve">Capturar los apellidos de la familia desde el panel. </w:t>
       </w:r>
     </w:p>
     <w:p>
@@ -4699,7 +4702,7 @@
           <w:szCs w:val="20"/>
           <w:lang w:val="es-ES"/>
         </w:rPr>
-        <w:t>Cuando lleguen: publicar el reglamento final de Arturo y atender la revisión de Legal del aviso.</w:t>
+        <w:t xml:space="preserve">Cuando lleguen: publicar el reglamento final de Arturo y atender la revisión de Legal del aviso. </w:t>
       </w:r>
     </w:p>
     <w:p>
@@ -4778,8 +4781,8 @@
         <w:tblLook w:val="04A0" w:firstRow="1" w:lastRow="0" w:firstColumn="1" w:lastColumn="0" w:noHBand="0" w:noVBand="1"/>
       </w:tblPr>
       <w:tblGrid>
-        <w:gridCol w:w="5375"/>
-        <w:gridCol w:w="4609"/>
+        <w:gridCol w:w="4992"/>
+        <w:gridCol w:w="4992"/>
       </w:tblGrid>
       <w:tr>
         <w:trPr>
@@ -4788,7 +4791,7 @@
         </w:trPr>
         <w:tc>
           <w:tcPr>
-            <w:tcW w:w="2692" w:type="pct"/>
+            <w:tcW w:w="2500" w:type="pct"/>
             <w:tcBorders>
               <w:top w:val="single" w:sz="6" w:space="0" w:color="CFD6E0"/>
               <w:left w:val="single" w:sz="6" w:space="0" w:color="CFD6E0"/>
@@ -4831,7 +4834,7 @@
         </w:tc>
         <w:tc>
           <w:tcPr>
-            <w:tcW w:w="2308" w:type="pct"/>
+            <w:tcW w:w="2500" w:type="pct"/>
             <w:tcBorders>
               <w:top w:val="single" w:sz="6" w:space="0" w:color="CFD6E0"/>
               <w:left w:val="single" w:sz="6" w:space="0" w:color="CFD6E0"/>
@@ -4879,7 +4882,7 @@
         </w:trPr>
         <w:tc>
           <w:tcPr>
-            <w:tcW w:w="2692" w:type="pct"/>
+            <w:tcW w:w="2500" w:type="pct"/>
             <w:tcBorders>
               <w:top w:val="single" w:sz="6" w:space="0" w:color="CFD6E0"/>
               <w:left w:val="single" w:sz="6" w:space="0" w:color="CFD6E0"/>
@@ -4917,7 +4920,7 @@
         </w:tc>
         <w:tc>
           <w:tcPr>
-            <w:tcW w:w="2308" w:type="pct"/>
+            <w:tcW w:w="2500" w:type="pct"/>
             <w:tcBorders>
               <w:top w:val="single" w:sz="6" w:space="0" w:color="CFD6E0"/>
               <w:left w:val="single" w:sz="6" w:space="0" w:color="CFD6E0"/>
@@ -4960,7 +4963,7 @@
         </w:trPr>
         <w:tc>
           <w:tcPr>
-            <w:tcW w:w="2692" w:type="pct"/>
+            <w:tcW w:w="2500" w:type="pct"/>
             <w:tcBorders>
               <w:top w:val="single" w:sz="6" w:space="0" w:color="CFD6E0"/>
               <w:left w:val="single" w:sz="6" w:space="0" w:color="CFD6E0"/>
@@ -4998,7 +5001,7 @@
         </w:tc>
         <w:tc>
           <w:tcPr>
-            <w:tcW w:w="2308" w:type="pct"/>
+            <w:tcW w:w="2500" w:type="pct"/>
             <w:tcBorders>
               <w:top w:val="single" w:sz="6" w:space="0" w:color="CFD6E0"/>
               <w:left w:val="single" w:sz="6" w:space="0" w:color="CFD6E0"/>
@@ -5041,7 +5044,7 @@
         </w:trPr>
         <w:tc>
           <w:tcPr>
-            <w:tcW w:w="2692" w:type="pct"/>
+            <w:tcW w:w="2500" w:type="pct"/>
             <w:tcBorders>
               <w:top w:val="single" w:sz="6" w:space="0" w:color="CFD6E0"/>
               <w:left w:val="single" w:sz="6" w:space="0" w:color="CFD6E0"/>
@@ -5079,7 +5082,7 @@
         </w:tc>
         <w:tc>
           <w:tcPr>
-            <w:tcW w:w="2308" w:type="pct"/>
+            <w:tcW w:w="2500" w:type="pct"/>
             <w:tcBorders>
               <w:top w:val="single" w:sz="6" w:space="0" w:color="CFD6E0"/>
               <w:left w:val="single" w:sz="6" w:space="0" w:color="CFD6E0"/>
@@ -5122,7 +5125,7 @@
         </w:trPr>
         <w:tc>
           <w:tcPr>
-            <w:tcW w:w="2692" w:type="pct"/>
+            <w:tcW w:w="2500" w:type="pct"/>
             <w:tcBorders>
               <w:top w:val="single" w:sz="6" w:space="0" w:color="CFD6E0"/>
               <w:left w:val="single" w:sz="6" w:space="0" w:color="CFD6E0"/>
@@ -5154,14 +5157,13 @@
                 <w:sz w:val="17"/>
                 <w:szCs w:val="18"/>
               </w:rPr>
-              <w:lastRenderedPageBreak/>
               <w:t>Nadie corta caja hasta que exista el rol de contador.</w:t>
             </w:r>
           </w:p>
         </w:tc>
         <w:tc>
           <w:tcPr>
-            <w:tcW w:w="2308" w:type="pct"/>
+            <w:tcW w:w="2500" w:type="pct"/>
             <w:tcBorders>
               <w:top w:val="single" w:sz="6" w:space="0" w:color="CFD6E0"/>
               <w:left w:val="single" w:sz="6" w:space="0" w:color="CFD6E0"/>
@@ -5249,8 +5251,8 @@
         <w:tblLook w:val="04A0" w:firstRow="1" w:lastRow="0" w:firstColumn="1" w:lastColumn="0" w:noHBand="0" w:noVBand="1"/>
       </w:tblPr>
       <w:tblGrid>
-        <w:gridCol w:w="9728"/>
-        <w:gridCol w:w="256"/>
+        <w:gridCol w:w="4992"/>
+        <w:gridCol w:w="4992"/>
       </w:tblGrid>
       <w:tr>
         <w:trPr>
@@ -5259,7 +5261,7 @@
         </w:trPr>
         <w:tc>
           <w:tcPr>
-            <w:tcW w:w="4872" w:type="pct"/>
+            <w:tcW w:w="2500" w:type="pct"/>
             <w:tcBorders>
               <w:top w:val="single" w:sz="6" w:space="0" w:color="CFD6E0"/>
               <w:left w:val="single" w:sz="6" w:space="0" w:color="CFD6E0"/>
@@ -5287,7 +5289,7 @@
         </w:tc>
         <w:tc>
           <w:tcPr>
-            <w:tcW w:w="128" w:type="pct"/>
+            <w:tcW w:w="2500" w:type="pct"/>
             <w:tcBorders>
               <w:top w:val="single" w:sz="6" w:space="0" w:color="CFD6E0"/>
               <w:left w:val="single" w:sz="6" w:space="0" w:color="CFD6E0"/>
@@ -5321,7 +5323,7 @@
         </w:trPr>
         <w:tc>
           <w:tcPr>
-            <w:tcW w:w="4872" w:type="pct"/>
+            <w:tcW w:w="2500" w:type="pct"/>
             <w:tcBorders>
               <w:top w:val="single" w:sz="6" w:space="0" w:color="CFD6E0"/>
               <w:left w:val="single" w:sz="6" w:space="0" w:color="CFD6E0"/>
@@ -5368,7 +5370,7 @@
         </w:tc>
         <w:tc>
           <w:tcPr>
-            <w:tcW w:w="128" w:type="pct"/>
+            <w:tcW w:w="2500" w:type="pct"/>
             <w:tcBorders>
               <w:top w:val="single" w:sz="6" w:space="0" w:color="CFD6E0"/>
               <w:left w:val="single" w:sz="6" w:space="0" w:color="CFD6E0"/>
@@ -5393,6 +5395,24 @@
                 <w:szCs w:val="18"/>
               </w:rPr>
             </w:pPr>
+            <w:r>
+              <w:rPr>
+                <w:rFonts w:ascii="Segoe UI" w:eastAsia="Times New Roman" w:hAnsi="Segoe UI" w:cs="Segoe UI"/>
+                <w:color w:val="1C2333"/>
+                <w:sz w:val="17"/>
+                <w:szCs w:val="18"/>
+              </w:rPr>
+              <w:t xml:space="preserve">Pruebas del equipo con datos inventados desde el viernes 11 hasta el lunes 14 a las 08:05; sus folios se borraron en la limpieza. La última alta de prueba entró durante la limpieza y obligó a una pasada más. </w:t>
+            </w:r>
+            <w:r>
+              <w:rPr>
+                <w:rStyle w:val="Fuerte"/>
+                <w:rFonts w:ascii="Segoe UI" w:eastAsia="Times New Roman" w:hAnsi="Segoe UI" w:cs="Segoe UI"/>
+                <w:sz w:val="17"/>
+                <w:szCs w:val="18"/>
+              </w:rPr>
+              <w:t>Los resultados por bloque (A a E) no se anotaron en esta sección.</w:t>
+            </w:r>
           </w:p>
         </w:tc>
       </w:tr>
@@ -5402,7 +5422,7 @@
         </w:trPr>
         <w:tc>
           <w:tcPr>
-            <w:tcW w:w="4872" w:type="pct"/>
+            <w:tcW w:w="2500" w:type="pct"/>
             <w:tcBorders>
               <w:top w:val="single" w:sz="6" w:space="0" w:color="CFD6E0"/>
               <w:left w:val="single" w:sz="6" w:space="0" w:color="CFD6E0"/>
@@ -5443,22 +5463,13 @@
                 <w:sz w:val="17"/>
                 <w:szCs w:val="18"/>
               </w:rPr>
-              <w:t xml:space="preserve"> </w:t>
-            </w:r>
-            <w:r>
-              <w:rPr>
-                <w:rFonts w:ascii="Segoe UI" w:eastAsia="Times New Roman" w:hAnsi="Segoe UI" w:cs="Segoe UI"/>
-                <w:color w:val="1C2333"/>
-                <w:sz w:val="17"/>
-                <w:szCs w:val="18"/>
-              </w:rPr>
-              <w:t>(respaldo de Supabase revisado; JSON guardado en Campo/datos/)</w:t>
+              <w:t xml:space="preserve"> (respaldo de Supabase revisado; JSON guardado en Campo/datos/)</w:t>
             </w:r>
           </w:p>
         </w:tc>
         <w:tc>
           <w:tcPr>
-            <w:tcW w:w="128" w:type="pct"/>
+            <w:tcW w:w="2500" w:type="pct"/>
             <w:tcBorders>
               <w:top w:val="single" w:sz="6" w:space="0" w:color="CFD6E0"/>
               <w:left w:val="single" w:sz="6" w:space="0" w:color="CFD6E0"/>
@@ -5483,6 +5494,41 @@
                 <w:szCs w:val="18"/>
               </w:rPr>
             </w:pPr>
+            <w:r>
+              <w:rPr>
+                <w:rStyle w:val="Fuerte"/>
+                <w:rFonts w:ascii="Segoe UI" w:eastAsia="Times New Roman" w:hAnsi="Segoe UI" w:cs="Segoe UI"/>
+                <w:sz w:val="17"/>
+                <w:szCs w:val="18"/>
+              </w:rPr>
+              <w:t>Por confirmar:</w:t>
+            </w:r>
+            <w:r>
+              <w:rPr>
+                <w:rFonts w:ascii="Segoe UI" w:eastAsia="Times New Roman" w:hAnsi="Segoe UI" w:cs="Segoe UI"/>
+                <w:color w:val="1C2333"/>
+                <w:sz w:val="17"/>
+                <w:szCs w:val="18"/>
+              </w:rPr>
+              <w:t xml:space="preserve"> en </w:t>
+            </w:r>
+            <w:r>
+              <w:rPr>
+                <w:rStyle w:val="CdigoHTML"/>
+                <w:color w:val="1C2333"/>
+                <w:sz w:val="17"/>
+              </w:rPr>
+              <w:t>Campo/datos/</w:t>
+            </w:r>
+            <w:r>
+              <w:rPr>
+                <w:rFonts w:ascii="Segoe UI" w:eastAsia="Times New Roman" w:hAnsi="Segoe UI" w:cs="Segoe UI"/>
+                <w:color w:val="1C2333"/>
+                <w:sz w:val="17"/>
+                <w:szCs w:val="18"/>
+              </w:rPr>
+              <w:t xml:space="preserve"> no hay JSON del PASO 1.</w:t>
+            </w:r>
           </w:p>
         </w:tc>
       </w:tr>
@@ -5492,7 +5538,7 @@
         </w:trPr>
         <w:tc>
           <w:tcPr>
-            <w:tcW w:w="4872" w:type="pct"/>
+            <w:tcW w:w="2500" w:type="pct"/>
             <w:tcBorders>
               <w:top w:val="single" w:sz="6" w:space="0" w:color="CFD6E0"/>
               <w:left w:val="single" w:sz="6" w:space="0" w:color="CFD6E0"/>
@@ -5539,7 +5585,7 @@
         </w:tc>
         <w:tc>
           <w:tcPr>
-            <w:tcW w:w="128" w:type="pct"/>
+            <w:tcW w:w="2500" w:type="pct"/>
             <w:tcBorders>
               <w:top w:val="single" w:sz="6" w:space="0" w:color="CFD6E0"/>
               <w:left w:val="single" w:sz="6" w:space="0" w:color="CFD6E0"/>
@@ -5564,6 +5610,33 @@
                 <w:szCs w:val="18"/>
               </w:rPr>
             </w:pPr>
+            <w:r>
+              <w:rPr>
+                <w:rFonts w:ascii="Segoe UI" w:eastAsia="Times New Roman" w:hAnsi="Segoe UI" w:cs="Segoe UI"/>
+                <w:color w:val="1C2333"/>
+                <w:sz w:val="17"/>
+                <w:szCs w:val="18"/>
+              </w:rPr>
+              <w:t xml:space="preserve">Lunes 14 por la mañana, antes de abrir, por Gerardo (los ajustes del script quedaron en commits de 07:48 a 08:09). Hizo falta </w:t>
+            </w:r>
+            <w:r>
+              <w:rPr>
+                <w:rStyle w:val="Fuerte"/>
+                <w:rFonts w:ascii="Segoe UI" w:eastAsia="Times New Roman" w:hAnsi="Segoe UI" w:cs="Segoe UI"/>
+                <w:sz w:val="17"/>
+                <w:szCs w:val="18"/>
+              </w:rPr>
+              <w:t>tres pasadas</w:t>
+            </w:r>
+            <w:r>
+              <w:rPr>
+                <w:rFonts w:ascii="Segoe UI" w:eastAsia="Times New Roman" w:hAnsi="Segoe UI" w:cs="Segoe UI"/>
+                <w:color w:val="1C2333"/>
+                <w:sz w:val="17"/>
+                <w:szCs w:val="18"/>
+              </w:rPr>
+              <w:t>: las dos primeras las detuvieron sus propias guardias porque entraron pruebas del equipo entre la lectura y el borrado. Resultado: padrón, pagos, firmas registradas, movimientos, solicitudes y bitácora en cero; folios reiniciados; inventario conservado (11 TAGs, todos disponibles).</w:t>
+            </w:r>
           </w:p>
         </w:tc>
       </w:tr>
@@ -5573,7 +5646,7 @@
         </w:trPr>
         <w:tc>
           <w:tcPr>
-            <w:tcW w:w="4872" w:type="pct"/>
+            <w:tcW w:w="2500" w:type="pct"/>
             <w:tcBorders>
               <w:top w:val="single" w:sz="6" w:space="0" w:color="CFD6E0"/>
               <w:left w:val="single" w:sz="6" w:space="0" w:color="CFD6E0"/>
@@ -5620,7 +5693,7 @@
         </w:tc>
         <w:tc>
           <w:tcPr>
-            <w:tcW w:w="128" w:type="pct"/>
+            <w:tcW w:w="2500" w:type="pct"/>
             <w:tcBorders>
               <w:top w:val="single" w:sz="6" w:space="0" w:color="CFD6E0"/>
               <w:left w:val="single" w:sz="6" w:space="0" w:color="CFD6E0"/>
@@ -5645,6 +5718,42 @@
                 <w:szCs w:val="18"/>
               </w:rPr>
             </w:pPr>
+            <w:r>
+              <w:rPr>
+                <w:rStyle w:val="Fuerte"/>
+                <w:rFonts w:ascii="Segoe UI" w:eastAsia="Times New Roman" w:hAnsi="Segoe UI" w:cs="Segoe UI"/>
+                <w:sz w:val="17"/>
+                <w:szCs w:val="18"/>
+              </w:rPr>
+              <w:t>No se vació el almacenamiento.</w:t>
+            </w:r>
+            <w:r>
+              <w:rPr>
+                <w:rFonts w:ascii="Segoe UI" w:eastAsia="Times New Roman" w:hAnsi="Segoe UI" w:cs="Segoe UI"/>
+                <w:color w:val="1C2333"/>
+                <w:sz w:val="17"/>
+                <w:szCs w:val="18"/>
+              </w:rPr>
+              <w:t xml:space="preserve"> Al 15-sep hay 18 imágenes: 7 de las familias del lunes y 11 sin expediente — 1 del 18-ago (10:17), 5 del 10-sep (13:34, 14:29, 14:43, 15:04 y 15:22), 3 del 11-sep (14:04, 15:47 y 15:50) y 2 del 14-sep (07:57 y 08:05, pruebas antes de abrir). Las del 10 y 11-sep coinciden con los incidentes del alta: pueden ser pruebas o altas rechazadas. </w:t>
+            </w:r>
+            <w:r>
+              <w:rPr>
+                <w:rStyle w:val="Fuerte"/>
+                <w:rFonts w:ascii="Segoe UI" w:eastAsia="Times New Roman" w:hAnsi="Segoe UI" w:cs="Segoe UI"/>
+                <w:sz w:val="17"/>
+                <w:szCs w:val="18"/>
+              </w:rPr>
+              <w:t>Ninguna es posterior a la apertura.</w:t>
+            </w:r>
+            <w:r>
+              <w:rPr>
+                <w:rFonts w:ascii="Segoe UI" w:eastAsia="Times New Roman" w:hAnsi="Segoe UI" w:cs="Segoe UI"/>
+                <w:color w:val="1C2333"/>
+                <w:sz w:val="17"/>
+                <w:szCs w:val="18"/>
+              </w:rPr>
+              <w:t xml:space="preserve"> Pendiente: borrar las 11 a mano desde el tablero.</w:t>
+            </w:r>
           </w:p>
         </w:tc>
       </w:tr>
@@ -5654,7 +5763,7 @@
         </w:trPr>
         <w:tc>
           <w:tcPr>
-            <w:tcW w:w="4872" w:type="pct"/>
+            <w:tcW w:w="2500" w:type="pct"/>
             <w:tcBorders>
               <w:top w:val="single" w:sz="6" w:space="0" w:color="CFD6E0"/>
               <w:left w:val="single" w:sz="6" w:space="0" w:color="CFD6E0"/>
@@ -5695,13 +5804,22 @@
                 <w:sz w:val="17"/>
                 <w:szCs w:val="18"/>
               </w:rPr>
-              <w:t xml:space="preserve"> (salida el lunes 14-sep: sí o no; acepta los riesgos de la sección 8)</w:t>
+              <w:t xml:space="preserve"> </w:t>
+            </w:r>
+            <w:r>
+              <w:rPr>
+                <w:rFonts w:ascii="Segoe UI" w:eastAsia="Times New Roman" w:hAnsi="Segoe UI" w:cs="Segoe UI"/>
+                <w:color w:val="1C2333"/>
+                <w:sz w:val="17"/>
+                <w:szCs w:val="18"/>
+              </w:rPr>
+              <w:t>(salida el lunes 14-sep: sí o no; acepta los riesgos de la sección 8)</w:t>
             </w:r>
           </w:p>
         </w:tc>
         <w:tc>
           <w:tcPr>
-            <w:tcW w:w="128" w:type="pct"/>
+            <w:tcW w:w="2500" w:type="pct"/>
             <w:tcBorders>
               <w:top w:val="single" w:sz="6" w:space="0" w:color="CFD6E0"/>
               <w:left w:val="single" w:sz="6" w:space="0" w:color="CFD6E0"/>
@@ -5726,6 +5844,24 @@
                 <w:szCs w:val="18"/>
               </w:rPr>
             </w:pPr>
+            <w:r>
+              <w:rPr>
+                <w:rStyle w:val="Fuerte"/>
+                <w:rFonts w:ascii="Segoe UI" w:eastAsia="Times New Roman" w:hAnsi="Segoe UI" w:cs="Segoe UI"/>
+                <w:sz w:val="17"/>
+                <w:szCs w:val="18"/>
+              </w:rPr>
+              <w:t>Salida el lunes 14: sí.</w:t>
+            </w:r>
+            <w:r>
+              <w:rPr>
+                <w:rFonts w:ascii="Segoe UI" w:eastAsia="Times New Roman" w:hAnsi="Segoe UI" w:cs="Segoe UI"/>
+                <w:color w:val="1C2333"/>
+                <w:sz w:val="17"/>
+                <w:szCs w:val="18"/>
+              </w:rPr>
+              <w:t xml:space="preserve"> SATAG operó ese día con familias reales y Miguel instaló uno de los TAGs. La aceptación de los riesgos de la sección 8 no quedó por escrito.</w:t>
+            </w:r>
           </w:p>
         </w:tc>
       </w:tr>
@@ -5735,7 +5871,7 @@
         </w:trPr>
         <w:tc>
           <w:tcPr>
-            <w:tcW w:w="4872" w:type="pct"/>
+            <w:tcW w:w="2500" w:type="pct"/>
             <w:tcBorders>
               <w:top w:val="single" w:sz="6" w:space="0" w:color="CFD6E0"/>
               <w:left w:val="single" w:sz="6" w:space="0" w:color="CFD6E0"/>
@@ -5782,7 +5918,7 @@
         </w:tc>
         <w:tc>
           <w:tcPr>
-            <w:tcW w:w="128" w:type="pct"/>
+            <w:tcW w:w="2500" w:type="pct"/>
             <w:tcBorders>
               <w:top w:val="single" w:sz="6" w:space="0" w:color="CFD6E0"/>
               <w:left w:val="single" w:sz="6" w:space="0" w:color="CFD6E0"/>
@@ -5807,6 +5943,33 @@
                 <w:szCs w:val="18"/>
               </w:rPr>
             </w:pPr>
+            <w:r>
+              <w:rPr>
+                <w:rFonts w:ascii="Segoe UI" w:eastAsia="Times New Roman" w:hAnsi="Segoe UI" w:cs="Segoe UI"/>
+                <w:color w:val="1C2333"/>
+                <w:sz w:val="17"/>
+                <w:szCs w:val="18"/>
+              </w:rPr>
+              <w:t xml:space="preserve">Zairet cobró los siete TAGs del día. </w:t>
+            </w:r>
+            <w:r>
+              <w:rPr>
+                <w:rStyle w:val="Fuerte"/>
+                <w:rFonts w:ascii="Segoe UI" w:eastAsia="Times New Roman" w:hAnsi="Segoe UI" w:cs="Segoe UI"/>
+                <w:sz w:val="17"/>
+                <w:szCs w:val="18"/>
+              </w:rPr>
+              <w:t>Por confirmar</w:t>
+            </w:r>
+            <w:r>
+              <w:rPr>
+                <w:rFonts w:ascii="Segoe UI" w:eastAsia="Times New Roman" w:hAnsi="Segoe UI" w:cs="Segoe UI"/>
+                <w:color w:val="1C2333"/>
+                <w:sz w:val="17"/>
+                <w:szCs w:val="18"/>
+              </w:rPr>
+              <w:t xml:space="preserve"> cuándo se avisó a Lidia, Ángel y el CP Vicente.</w:t>
+            </w:r>
           </w:p>
         </w:tc>
       </w:tr>
@@ -5816,7 +5979,7 @@
         </w:trPr>
         <w:tc>
           <w:tcPr>
-            <w:tcW w:w="4872" w:type="pct"/>
+            <w:tcW w:w="2500" w:type="pct"/>
             <w:tcBorders>
               <w:top w:val="single" w:sz="6" w:space="0" w:color="CFD6E0"/>
               <w:left w:val="single" w:sz="6" w:space="0" w:color="CFD6E0"/>
@@ -5854,7 +6017,7 @@
         </w:tc>
         <w:tc>
           <w:tcPr>
-            <w:tcW w:w="128" w:type="pct"/>
+            <w:tcW w:w="2500" w:type="pct"/>
             <w:tcBorders>
               <w:top w:val="single" w:sz="6" w:space="0" w:color="CFD6E0"/>
               <w:left w:val="single" w:sz="6" w:space="0" w:color="CFD6E0"/>
@@ -5879,6 +6042,77 @@
                 <w:szCs w:val="18"/>
               </w:rPr>
             </w:pPr>
+            <w:r>
+              <w:rPr>
+                <w:rStyle w:val="Fuerte"/>
+                <w:rFonts w:ascii="Segoe UI" w:eastAsia="Times New Roman" w:hAnsi="Segoe UI" w:cs="Segoe UI"/>
+                <w:sz w:val="17"/>
+                <w:szCs w:val="18"/>
+              </w:rPr>
+              <w:t>Primer día:</w:t>
+            </w:r>
+            <w:r>
+              <w:rPr>
+                <w:rFonts w:ascii="Segoe UI" w:eastAsia="Times New Roman" w:hAnsi="Segoe UI" w:cs="Segoe UI"/>
+                <w:color w:val="1C2333"/>
+                <w:sz w:val="17"/>
+                <w:szCs w:val="18"/>
+              </w:rPr>
+              <w:t xml:space="preserve"> </w:t>
+            </w:r>
+            <w:r>
+              <w:rPr>
+                <w:rFonts w:ascii="Segoe UI" w:eastAsia="Times New Roman" w:hAnsi="Segoe UI" w:cs="Segoe UI"/>
+                <w:color w:val="1C2333"/>
+                <w:sz w:val="17"/>
+                <w:szCs w:val="18"/>
+              </w:rPr>
+              <w:t xml:space="preserve">7 altas por SATAG entre 11:15 y 13:57 (6 padres y 1 maestro), 7 cobros y 7 instalaciones, sin ningún trámite a medias; ese mismo día se instalaron otros 8 TAGs con el proceso en papel. Del envío del formulario al TAG instalado, mediana de 8 minutos. </w:t>
+            </w:r>
+            <w:r>
+              <w:rPr>
+                <w:rStyle w:val="Fuerte"/>
+                <w:rFonts w:ascii="Segoe UI" w:eastAsia="Times New Roman" w:hAnsi="Segoe UI" w:cs="Segoe UI"/>
+                <w:sz w:val="17"/>
+                <w:szCs w:val="18"/>
+              </w:rPr>
+              <w:t>Hallazgos:</w:t>
+            </w:r>
+            <w:r>
+              <w:rPr>
+                <w:rFonts w:ascii="Segoe UI" w:eastAsia="Times New Roman" w:hAnsi="Segoe UI" w:cs="Segoe UI"/>
+                <w:color w:val="1C2333"/>
+                <w:sz w:val="17"/>
+                <w:szCs w:val="18"/>
+              </w:rPr>
+              <w:t xml:space="preserve"> </w:t>
+            </w:r>
+            <w:r>
+              <w:rPr>
+                <w:rFonts w:ascii="Segoe UI" w:eastAsia="Times New Roman" w:hAnsi="Segoe UI" w:cs="Segoe UI"/>
+                <w:color w:val="1C2333"/>
+                <w:sz w:val="17"/>
+                <w:szCs w:val="18"/>
+              </w:rPr>
+              <w:t xml:space="preserve">(1) ZK no activaba los TAGs precargados en el departamento Padres de familia; se corrigió con el departamento STOCK SATAG. (2) Administración llamaba a TI después de cada cobro; de ahí el aviso en Google Chat. (3) Las siete instalaciones las hizo Sistemas con perfil super: falta la primera con una cuenta de TI. (4) Miguel pidió cuatro ajustes del alta (SC-029). Detalle y cifras: </w:t>
+            </w:r>
+            <w:r>
+              <w:rPr>
+                <w:rStyle w:val="CdigoHTML"/>
+                <w:color w:val="1C2333"/>
+                <w:sz w:val="17"/>
+              </w:rPr>
+              <w:t>Campo/02 - Primer lunes en produccion (14-sep).md</w:t>
+            </w:r>
+            <w:r>
+              <w:rPr>
+                <w:rFonts w:ascii="Segoe UI" w:eastAsia="Times New Roman" w:hAnsi="Segoe UI" w:cs="Segoe UI"/>
+                <w:color w:val="1C2333"/>
+                <w:sz w:val="17"/>
+                <w:szCs w:val="18"/>
+              </w:rPr>
+              <w:t>.</w:t>
+            </w:r>
           </w:p>
         </w:tc>
       </w:tr>
@@ -5903,9 +6137,9 @@
 <file path=word/numbering.xml><?xml version="1.0" encoding="utf-8"?>
 <w:numbering xmlns:wpc="http://schemas.microsoft.com/office/word/2010/wordprocessingCanvas" xmlns:cx="http://schemas.microsoft.com/office/drawing/2014/chartex" xmlns:cx1="http://schemas.microsoft.com/office/drawing/2015/9/8/chartex" xmlns:cx2="http://schemas.microsoft.com/office/drawing/2015/10/21/chartex" xmlns:cx3="http://schemas.microsoft.com/office/drawing/2016/5/9/chartex" xmlns:cx4="http://schemas.microsoft.com/office/drawing/2016/5/10/chartex" xmlns:cx5="http://schemas.microsoft.com/office/drawing/2016/5/11/chartex" xmlns:cx6="http://schemas.microsoft.com/office/drawing/2016/5/12/chartex" xmlns:cx7="http://schemas.microsoft.com/office/drawing/2016/5/13/chartex" xmlns:cx8="http://schemas.microsoft.com/office/drawing/2016/5/14/chartex" xmlns:mc="http://schemas.openxmlformats.org/markup-compatibility/2006" xmlns:aink="http://schemas.microsoft.com/office/drawing/2016/ink" xmlns:am3d="http://schemas.microsoft.com/office/drawing/2017/model3d" xmlns:o="urn:schemas-microsoft-com:office:office" xmlns:oel="http://schemas.microsoft.com/office/2019/extlst" xmlns:r="http://schemas.openxmlformats.org/officeDocument/2006/relationships" xmlns:m="http://schemas.openxmlformats.org/officeDocument/2006/math" xmlns:v="urn:schemas-microsoft-com:vml" xmlns:wp14="http://schemas.microsoft.com/office/word/2010/wordprocessingDrawing" xmlns:wp="http://schemas.openxmlformats.org/drawingml/2006/wordprocessingDrawing" xmlns:w10="urn:schemas-microsoft-com:office:word" xmlns:w="http://schemas.openxmlformats.org/wordprocessingml/2006/main" xmlns:w14="http://schemas.microsoft.com/office/word/2010/wordml" xmlns:w15="http://schemas.microsoft.com/office/word/2012/wordml" xmlns:w16cex="http://schemas.microsoft.com/office/word/2018/wordml/cex" xmlns:w16cid="http://schemas.microsoft.com/office/word/2016/wordml/cid" xmlns:w16="http://schemas.microsoft.com/office/word/2018/wordml" xmlns:w16du="http://schemas.microsoft.com/office/word/2023/wordml/word16du" xmlns:w16sdtdh="http://schemas.microsoft.com/office/word/2020/wordml/sdtdatahash" xmlns:w16sdtfl="http://schemas.microsoft.com/office/word/2024/wordml/sdtformatlock" xmlns:w16se="http://schemas.microsoft.com/office/word/2015/wordml/symex" xmlns:wpg="http://schemas.microsoft.com/office/word/2010/wordprocessingGroup" xmlns:wpi="http://schemas.microsoft.com/office/word/2010/wordprocessingInk" xmlns:wne="http://schemas.microsoft.com/office/word/2006/wordml" xmlns:wps="http://schemas.microsoft.com/office/word/2010/wordprocessingShape" mc:Ignorable="w14 w15 w16se w16cid w16 w16cex w16sdtdh w16sdtfl w16du wp14">
   <w:abstractNum w:abstractNumId="0" w15:restartNumberingAfterBreak="0">
-    <w:nsid w:val="00D754B9"/>
+    <w:nsid w:val="015C609B"/>
     <w:multiLevelType w:val="multilevel"/>
-    <w:tmpl w:val="F07C5544"/>
+    <w:tmpl w:val="E7868BE6"/>
     <w:lvl w:ilvl="0">
       <w:start w:val="1"/>
       <w:numFmt w:val="bullet"/>
@@ -6052,9 +6286,9 @@
     </w:lvl>
   </w:abstractNum>
   <w:abstractNum w:abstractNumId="1" w15:restartNumberingAfterBreak="0">
-    <w:nsid w:val="028012AE"/>
+    <w:nsid w:val="03563BAD"/>
     <w:multiLevelType w:val="multilevel"/>
-    <w:tmpl w:val="B566B5CC"/>
+    <w:tmpl w:val="1E0620D0"/>
     <w:lvl w:ilvl="0">
       <w:start w:val="1"/>
       <w:numFmt w:val="bullet"/>
@@ -6201,9 +6435,9 @@
     </w:lvl>
   </w:abstractNum>
   <w:abstractNum w:abstractNumId="2" w15:restartNumberingAfterBreak="0">
-    <w:nsid w:val="10246F5C"/>
+    <w:nsid w:val="04BF510E"/>
     <w:multiLevelType w:val="multilevel"/>
-    <w:tmpl w:val="B97E97EC"/>
+    <w:tmpl w:val="B1CC5528"/>
     <w:lvl w:ilvl="0">
       <w:start w:val="1"/>
       <w:numFmt w:val="bullet"/>
@@ -6350,9 +6584,9 @@
     </w:lvl>
   </w:abstractNum>
   <w:abstractNum w:abstractNumId="3" w15:restartNumberingAfterBreak="0">
-    <w:nsid w:val="13321ADF"/>
+    <w:nsid w:val="0C652EDA"/>
     <w:multiLevelType w:val="multilevel"/>
-    <w:tmpl w:val="06F06760"/>
+    <w:tmpl w:val="5FDE1B2E"/>
     <w:lvl w:ilvl="0">
       <w:start w:val="1"/>
       <w:numFmt w:val="bullet"/>
@@ -6499,9 +6733,9 @@
     </w:lvl>
   </w:abstractNum>
   <w:abstractNum w:abstractNumId="4" w15:restartNumberingAfterBreak="0">
-    <w:nsid w:val="16CD693F"/>
+    <w:nsid w:val="174E30B4"/>
     <w:multiLevelType w:val="multilevel"/>
-    <w:tmpl w:val="A77A85AC"/>
+    <w:tmpl w:val="42BA62C0"/>
     <w:lvl w:ilvl="0">
       <w:start w:val="1"/>
       <w:numFmt w:val="bullet"/>
@@ -6648,9 +6882,9 @@
     </w:lvl>
   </w:abstractNum>
   <w:abstractNum w:abstractNumId="5" w15:restartNumberingAfterBreak="0">
-    <w:nsid w:val="19E40195"/>
+    <w:nsid w:val="21A03CB5"/>
     <w:multiLevelType w:val="multilevel"/>
-    <w:tmpl w:val="DEEA7C1C"/>
+    <w:tmpl w:val="362A4A96"/>
     <w:lvl w:ilvl="0">
       <w:start w:val="1"/>
       <w:numFmt w:val="bullet"/>
@@ -6797,9 +7031,456 @@
     </w:lvl>
   </w:abstractNum>
   <w:abstractNum w:abstractNumId="6" w15:restartNumberingAfterBreak="0">
-    <w:nsid w:val="256F59E5"/>
+    <w:nsid w:val="302B14F9"/>
     <w:multiLevelType w:val="multilevel"/>
-    <w:tmpl w:val="FB5CC47C"/>
+    <w:tmpl w:val="A44EE4DA"/>
+    <w:lvl w:ilvl="0">
+      <w:start w:val="1"/>
+      <w:numFmt w:val="bullet"/>
+      <w:lvlText w:val=""/>
+      <w:lvlJc w:val="left"/>
+      <w:pPr>
+        <w:tabs>
+          <w:tab w:val="num" w:pos="720"/>
+        </w:tabs>
+        <w:ind w:left="720" w:hanging="360"/>
+      </w:pPr>
+      <w:rPr>
+        <w:rFonts w:ascii="Symbol" w:hAnsi="Symbol" w:hint="default"/>
+        <w:sz w:val="20"/>
+      </w:rPr>
+    </w:lvl>
+    <w:lvl w:ilvl="1" w:tentative="1">
+      <w:start w:val="1"/>
+      <w:numFmt w:val="bullet"/>
+      <w:lvlText w:val="o"/>
+      <w:lvlJc w:val="left"/>
+      <w:pPr>
+        <w:tabs>
+          <w:tab w:val="num" w:pos="1440"/>
+        </w:tabs>
+        <w:ind w:left="1440" w:hanging="360"/>
+      </w:pPr>
+      <w:rPr>
+        <w:rFonts w:ascii="Courier New" w:hAnsi="Courier New" w:hint="default"/>
+        <w:sz w:val="20"/>
+      </w:rPr>
+    </w:lvl>
+    <w:lvl w:ilvl="2" w:tentative="1">
+      <w:start w:val="1"/>
+      <w:numFmt w:val="bullet"/>
+      <w:lvlText w:val=""/>
+      <w:lvlJc w:val="left"/>
+      <w:pPr>
+        <w:tabs>
+          <w:tab w:val="num" w:pos="2160"/>
+        </w:tabs>
+        <w:ind w:left="2160" w:hanging="360"/>
+      </w:pPr>
+      <w:rPr>
+        <w:rFonts w:ascii="Wingdings" w:hAnsi="Wingdings" w:hint="default"/>
+        <w:sz w:val="20"/>
+      </w:rPr>
+    </w:lvl>
+    <w:lvl w:ilvl="3" w:tentative="1">
+      <w:start w:val="1"/>
+      <w:numFmt w:val="bullet"/>
+      <w:lvlText w:val=""/>
+      <w:lvlJc w:val="left"/>
+      <w:pPr>
+        <w:tabs>
+          <w:tab w:val="num" w:pos="2880"/>
+        </w:tabs>
+        <w:ind w:left="2880" w:hanging="360"/>
+      </w:pPr>
+      <w:rPr>
+        <w:rFonts w:ascii="Wingdings" w:hAnsi="Wingdings" w:hint="default"/>
+        <w:sz w:val="20"/>
+      </w:rPr>
+    </w:lvl>
+    <w:lvl w:ilvl="4" w:tentative="1">
+      <w:start w:val="1"/>
+      <w:numFmt w:val="bullet"/>
+      <w:lvlText w:val=""/>
+      <w:lvlJc w:val="left"/>
+      <w:pPr>
+        <w:tabs>
+          <w:tab w:val="num" w:pos="3600"/>
+        </w:tabs>
+        <w:ind w:left="3600" w:hanging="360"/>
+      </w:pPr>
+      <w:rPr>
+        <w:rFonts w:ascii="Wingdings" w:hAnsi="Wingdings" w:hint="default"/>
+        <w:sz w:val="20"/>
+      </w:rPr>
+    </w:lvl>
+    <w:lvl w:ilvl="5" w:tentative="1">
+      <w:start w:val="1"/>
+      <w:numFmt w:val="bullet"/>
+      <w:lvlText w:val=""/>
+      <w:lvlJc w:val="left"/>
+      <w:pPr>
+        <w:tabs>
+          <w:tab w:val="num" w:pos="4320"/>
+        </w:tabs>
+        <w:ind w:left="4320" w:hanging="360"/>
+      </w:pPr>
+      <w:rPr>
+        <w:rFonts w:ascii="Wingdings" w:hAnsi="Wingdings" w:hint="default"/>
+        <w:sz w:val="20"/>
+      </w:rPr>
+    </w:lvl>
+    <w:lvl w:ilvl="6" w:tentative="1">
+      <w:start w:val="1"/>
+      <w:numFmt w:val="bullet"/>
+      <w:lvlText w:val=""/>
+      <w:lvlJc w:val="left"/>
+      <w:pPr>
+        <w:tabs>
+          <w:tab w:val="num" w:pos="5040"/>
+        </w:tabs>
+        <w:ind w:left="5040" w:hanging="360"/>
+      </w:pPr>
+      <w:rPr>
+        <w:rFonts w:ascii="Wingdings" w:hAnsi="Wingdings" w:hint="default"/>
+        <w:sz w:val="20"/>
+      </w:rPr>
+    </w:lvl>
+    <w:lvl w:ilvl="7" w:tentative="1">
+      <w:start w:val="1"/>
+      <w:numFmt w:val="bullet"/>
+      <w:lvlText w:val=""/>
+      <w:lvlJc w:val="left"/>
+      <w:pPr>
+        <w:tabs>
+          <w:tab w:val="num" w:pos="5760"/>
+        </w:tabs>
+        <w:ind w:left="5760" w:hanging="360"/>
+      </w:pPr>
+      <w:rPr>
+        <w:rFonts w:ascii="Wingdings" w:hAnsi="Wingdings" w:hint="default"/>
+        <w:sz w:val="20"/>
+      </w:rPr>
+    </w:lvl>
+    <w:lvl w:ilvl="8" w:tentative="1">
+      <w:start w:val="1"/>
+      <w:numFmt w:val="bullet"/>
+      <w:lvlText w:val=""/>
+      <w:lvlJc w:val="left"/>
+      <w:pPr>
+        <w:tabs>
+          <w:tab w:val="num" w:pos="6480"/>
+        </w:tabs>
+        <w:ind w:left="6480" w:hanging="360"/>
+      </w:pPr>
+      <w:rPr>
+        <w:rFonts w:ascii="Wingdings" w:hAnsi="Wingdings" w:hint="default"/>
+        <w:sz w:val="20"/>
+      </w:rPr>
+    </w:lvl>
+  </w:abstractNum>
+  <w:abstractNum w:abstractNumId="7" w15:restartNumberingAfterBreak="0">
+    <w:nsid w:val="3B7B2834"/>
+    <w:multiLevelType w:val="multilevel"/>
+    <w:tmpl w:val="1DEE9634"/>
+    <w:lvl w:ilvl="0">
+      <w:start w:val="1"/>
+      <w:numFmt w:val="bullet"/>
+      <w:lvlText w:val=""/>
+      <w:lvlJc w:val="left"/>
+      <w:pPr>
+        <w:tabs>
+          <w:tab w:val="num" w:pos="720"/>
+        </w:tabs>
+        <w:ind w:left="720" w:hanging="360"/>
+      </w:pPr>
+      <w:rPr>
+        <w:rFonts w:ascii="Symbol" w:hAnsi="Symbol" w:hint="default"/>
+        <w:sz w:val="20"/>
+      </w:rPr>
+    </w:lvl>
+    <w:lvl w:ilvl="1" w:tentative="1">
+      <w:start w:val="1"/>
+      <w:numFmt w:val="bullet"/>
+      <w:lvlText w:val="o"/>
+      <w:lvlJc w:val="left"/>
+      <w:pPr>
+        <w:tabs>
+          <w:tab w:val="num" w:pos="1440"/>
+        </w:tabs>
+        <w:ind w:left="1440" w:hanging="360"/>
+      </w:pPr>
+      <w:rPr>
+        <w:rFonts w:ascii="Courier New" w:hAnsi="Courier New" w:hint="default"/>
+        <w:sz w:val="20"/>
+      </w:rPr>
+    </w:lvl>
+    <w:lvl w:ilvl="2" w:tentative="1">
+      <w:start w:val="1"/>
+      <w:numFmt w:val="bullet"/>
+      <w:lvlText w:val=""/>
+      <w:lvlJc w:val="left"/>
+      <w:pPr>
+        <w:tabs>
+          <w:tab w:val="num" w:pos="2160"/>
+        </w:tabs>
+        <w:ind w:left="2160" w:hanging="360"/>
+      </w:pPr>
+      <w:rPr>
+        <w:rFonts w:ascii="Wingdings" w:hAnsi="Wingdings" w:hint="default"/>
+        <w:sz w:val="20"/>
+      </w:rPr>
+    </w:lvl>
+    <w:lvl w:ilvl="3" w:tentative="1">
+      <w:start w:val="1"/>
+      <w:numFmt w:val="bullet"/>
+      <w:lvlText w:val=""/>
+      <w:lvlJc w:val="left"/>
+      <w:pPr>
+        <w:tabs>
+          <w:tab w:val="num" w:pos="2880"/>
+        </w:tabs>
+        <w:ind w:left="2880" w:hanging="360"/>
+      </w:pPr>
+      <w:rPr>
+        <w:rFonts w:ascii="Wingdings" w:hAnsi="Wingdings" w:hint="default"/>
+        <w:sz w:val="20"/>
+      </w:rPr>
+    </w:lvl>
+    <w:lvl w:ilvl="4" w:tentative="1">
+      <w:start w:val="1"/>
+      <w:numFmt w:val="bullet"/>
+      <w:lvlText w:val=""/>
+      <w:lvlJc w:val="left"/>
+      <w:pPr>
+        <w:tabs>
+          <w:tab w:val="num" w:pos="3600"/>
+        </w:tabs>
+        <w:ind w:left="3600" w:hanging="360"/>
+      </w:pPr>
+      <w:rPr>
+        <w:rFonts w:ascii="Wingdings" w:hAnsi="Wingdings" w:hint="default"/>
+        <w:sz w:val="20"/>
+      </w:rPr>
+    </w:lvl>
+    <w:lvl w:ilvl="5" w:tentative="1">
+      <w:start w:val="1"/>
+      <w:numFmt w:val="bullet"/>
+      <w:lvlText w:val=""/>
+      <w:lvlJc w:val="left"/>
+      <w:pPr>
+        <w:tabs>
+          <w:tab w:val="num" w:pos="4320"/>
+        </w:tabs>
+        <w:ind w:left="4320" w:hanging="360"/>
+      </w:pPr>
+      <w:rPr>
+        <w:rFonts w:ascii="Wingdings" w:hAnsi="Wingdings" w:hint="default"/>
+        <w:sz w:val="20"/>
+      </w:rPr>
+    </w:lvl>
+    <w:lvl w:ilvl="6" w:tentative="1">
+      <w:start w:val="1"/>
+      <w:numFmt w:val="bullet"/>
+      <w:lvlText w:val=""/>
+      <w:lvlJc w:val="left"/>
+      <w:pPr>
+        <w:tabs>
+          <w:tab w:val="num" w:pos="5040"/>
+        </w:tabs>
+        <w:ind w:left="5040" w:hanging="360"/>
+      </w:pPr>
+      <w:rPr>
+        <w:rFonts w:ascii="Wingdings" w:hAnsi="Wingdings" w:hint="default"/>
+        <w:sz w:val="20"/>
+      </w:rPr>
+    </w:lvl>
+    <w:lvl w:ilvl="7" w:tentative="1">
+      <w:start w:val="1"/>
+      <w:numFmt w:val="bullet"/>
+      <w:lvlText w:val=""/>
+      <w:lvlJc w:val="left"/>
+      <w:pPr>
+        <w:tabs>
+          <w:tab w:val="num" w:pos="5760"/>
+        </w:tabs>
+        <w:ind w:left="5760" w:hanging="360"/>
+      </w:pPr>
+      <w:rPr>
+        <w:rFonts w:ascii="Wingdings" w:hAnsi="Wingdings" w:hint="default"/>
+        <w:sz w:val="20"/>
+      </w:rPr>
+    </w:lvl>
+    <w:lvl w:ilvl="8" w:tentative="1">
+      <w:start w:val="1"/>
+      <w:numFmt w:val="bullet"/>
+      <w:lvlText w:val=""/>
+      <w:lvlJc w:val="left"/>
+      <w:pPr>
+        <w:tabs>
+          <w:tab w:val="num" w:pos="6480"/>
+        </w:tabs>
+        <w:ind w:left="6480" w:hanging="360"/>
+      </w:pPr>
+      <w:rPr>
+        <w:rFonts w:ascii="Wingdings" w:hAnsi="Wingdings" w:hint="default"/>
+        <w:sz w:val="20"/>
+      </w:rPr>
+    </w:lvl>
+  </w:abstractNum>
+  <w:abstractNum w:abstractNumId="8" w15:restartNumberingAfterBreak="0">
+    <w:nsid w:val="3BA91125"/>
+    <w:multiLevelType w:val="multilevel"/>
+    <w:tmpl w:val="E29E8B4A"/>
+    <w:lvl w:ilvl="0">
+      <w:start w:val="1"/>
+      <w:numFmt w:val="bullet"/>
+      <w:lvlText w:val=""/>
+      <w:lvlJc w:val="left"/>
+      <w:pPr>
+        <w:tabs>
+          <w:tab w:val="num" w:pos="720"/>
+        </w:tabs>
+        <w:ind w:left="720" w:hanging="360"/>
+      </w:pPr>
+      <w:rPr>
+        <w:rFonts w:ascii="Symbol" w:hAnsi="Symbol" w:hint="default"/>
+        <w:sz w:val="20"/>
+      </w:rPr>
+    </w:lvl>
+    <w:lvl w:ilvl="1" w:tentative="1">
+      <w:start w:val="1"/>
+      <w:numFmt w:val="bullet"/>
+      <w:lvlText w:val="o"/>
+      <w:lvlJc w:val="left"/>
+      <w:pPr>
+        <w:tabs>
+          <w:tab w:val="num" w:pos="1440"/>
+        </w:tabs>
+        <w:ind w:left="1440" w:hanging="360"/>
+      </w:pPr>
+      <w:rPr>
+        <w:rFonts w:ascii="Courier New" w:hAnsi="Courier New" w:hint="default"/>
+        <w:sz w:val="20"/>
+      </w:rPr>
+    </w:lvl>
+    <w:lvl w:ilvl="2" w:tentative="1">
+      <w:start w:val="1"/>
+      <w:numFmt w:val="bullet"/>
+      <w:lvlText w:val=""/>
+      <w:lvlJc w:val="left"/>
+      <w:pPr>
+        <w:tabs>
+          <w:tab w:val="num" w:pos="2160"/>
+        </w:tabs>
+        <w:ind w:left="2160" w:hanging="360"/>
+      </w:pPr>
+      <w:rPr>
+        <w:rFonts w:ascii="Wingdings" w:hAnsi="Wingdings" w:hint="default"/>
+        <w:sz w:val="20"/>
+      </w:rPr>
+    </w:lvl>
+    <w:lvl w:ilvl="3" w:tentative="1">
+      <w:start w:val="1"/>
+      <w:numFmt w:val="bullet"/>
+      <w:lvlText w:val=""/>
+      <w:lvlJc w:val="left"/>
+      <w:pPr>
+        <w:tabs>
+          <w:tab w:val="num" w:pos="2880"/>
+        </w:tabs>
+        <w:ind w:left="2880" w:hanging="360"/>
+      </w:pPr>
+      <w:rPr>
+        <w:rFonts w:ascii="Wingdings" w:hAnsi="Wingdings" w:hint="default"/>
+        <w:sz w:val="20"/>
+      </w:rPr>
+    </w:lvl>
+    <w:lvl w:ilvl="4" w:tentative="1">
+      <w:start w:val="1"/>
+      <w:numFmt w:val="bullet"/>
+      <w:lvlText w:val=""/>
+      <w:lvlJc w:val="left"/>
+      <w:pPr>
+        <w:tabs>
+          <w:tab w:val="num" w:pos="3600"/>
+        </w:tabs>
+        <w:ind w:left="3600" w:hanging="360"/>
+      </w:pPr>
+      <w:rPr>
+        <w:rFonts w:ascii="Wingdings" w:hAnsi="Wingdings" w:hint="default"/>
+        <w:sz w:val="20"/>
+      </w:rPr>
+    </w:lvl>
+    <w:lvl w:ilvl="5" w:tentative="1">
+      <w:start w:val="1"/>
+      <w:numFmt w:val="bullet"/>
+      <w:lvlText w:val=""/>
+      <w:lvlJc w:val="left"/>
+      <w:pPr>
+        <w:tabs>
+          <w:tab w:val="num" w:pos="4320"/>
+        </w:tabs>
+        <w:ind w:left="4320" w:hanging="360"/>
+      </w:pPr>
+      <w:rPr>
+        <w:rFonts w:ascii="Wingdings" w:hAnsi="Wingdings" w:hint="default"/>
+        <w:sz w:val="20"/>
+      </w:rPr>
+    </w:lvl>
+    <w:lvl w:ilvl="6" w:tentative="1">
+      <w:start w:val="1"/>
+      <w:numFmt w:val="bullet"/>
+      <w:lvlText w:val=""/>
+      <w:lvlJc w:val="left"/>
+      <w:pPr>
+        <w:tabs>
+          <w:tab w:val="num" w:pos="5040"/>
+        </w:tabs>
+        <w:ind w:left="5040" w:hanging="360"/>
+      </w:pPr>
+      <w:rPr>
+        <w:rFonts w:ascii="Wingdings" w:hAnsi="Wingdings" w:hint="default"/>
+        <w:sz w:val="20"/>
+      </w:rPr>
+    </w:lvl>
+    <w:lvl w:ilvl="7" w:tentative="1">
+      <w:start w:val="1"/>
+      <w:numFmt w:val="bullet"/>
+      <w:lvlText w:val=""/>
+      <w:lvlJc w:val="left"/>
+      <w:pPr>
+        <w:tabs>
+          <w:tab w:val="num" w:pos="5760"/>
+        </w:tabs>
+        <w:ind w:left="5760" w:hanging="360"/>
+      </w:pPr>
+      <w:rPr>
+        <w:rFonts w:ascii="Wingdings" w:hAnsi="Wingdings" w:hint="default"/>
+        <w:sz w:val="20"/>
+      </w:rPr>
+    </w:lvl>
+    <w:lvl w:ilvl="8" w:tentative="1">
+      <w:start w:val="1"/>
+      <w:numFmt w:val="bullet"/>
+      <w:lvlText w:val=""/>
+      <w:lvlJc w:val="left"/>
+      <w:pPr>
+        <w:tabs>
+          <w:tab w:val="num" w:pos="6480"/>
+        </w:tabs>
+        <w:ind w:left="6480" w:hanging="360"/>
+      </w:pPr>
+      <w:rPr>
+        <w:rFonts w:ascii="Wingdings" w:hAnsi="Wingdings" w:hint="default"/>
+        <w:sz w:val="20"/>
+      </w:rPr>
+    </w:lvl>
+  </w:abstractNum>
+  <w:abstractNum w:abstractNumId="9" w15:restartNumberingAfterBreak="0">
+    <w:nsid w:val="4B54283C"/>
+    <w:multiLevelType w:val="multilevel"/>
+    <w:tmpl w:val="6CDA7246"/>
     <w:lvl w:ilvl="0">
       <w:start w:val="1"/>
       <w:numFmt w:val="decimal"/>
@@ -6909,457 +7590,10 @@
       </w:pPr>
     </w:lvl>
   </w:abstractNum>
-  <w:abstractNum w:abstractNumId="7" w15:restartNumberingAfterBreak="0">
-    <w:nsid w:val="3DBE5BD3"/>
+  <w:abstractNum w:abstractNumId="10" w15:restartNumberingAfterBreak="0">
+    <w:nsid w:val="4DBD06AF"/>
     <w:multiLevelType w:val="multilevel"/>
-    <w:tmpl w:val="FCD89FFA"/>
-    <w:lvl w:ilvl="0">
-      <w:start w:val="1"/>
-      <w:numFmt w:val="bullet"/>
-      <w:lvlText w:val=""/>
-      <w:lvlJc w:val="left"/>
-      <w:pPr>
-        <w:tabs>
-          <w:tab w:val="num" w:pos="720"/>
-        </w:tabs>
-        <w:ind w:left="720" w:hanging="360"/>
-      </w:pPr>
-      <w:rPr>
-        <w:rFonts w:ascii="Symbol" w:hAnsi="Symbol" w:hint="default"/>
-        <w:sz w:val="20"/>
-      </w:rPr>
-    </w:lvl>
-    <w:lvl w:ilvl="1" w:tentative="1">
-      <w:start w:val="1"/>
-      <w:numFmt w:val="bullet"/>
-      <w:lvlText w:val="o"/>
-      <w:lvlJc w:val="left"/>
-      <w:pPr>
-        <w:tabs>
-          <w:tab w:val="num" w:pos="1440"/>
-        </w:tabs>
-        <w:ind w:left="1440" w:hanging="360"/>
-      </w:pPr>
-      <w:rPr>
-        <w:rFonts w:ascii="Courier New" w:hAnsi="Courier New" w:hint="default"/>
-        <w:sz w:val="20"/>
-      </w:rPr>
-    </w:lvl>
-    <w:lvl w:ilvl="2" w:tentative="1">
-      <w:start w:val="1"/>
-      <w:numFmt w:val="bullet"/>
-      <w:lvlText w:val=""/>
-      <w:lvlJc w:val="left"/>
-      <w:pPr>
-        <w:tabs>
-          <w:tab w:val="num" w:pos="2160"/>
-        </w:tabs>
-        <w:ind w:left="2160" w:hanging="360"/>
-      </w:pPr>
-      <w:rPr>
-        <w:rFonts w:ascii="Wingdings" w:hAnsi="Wingdings" w:hint="default"/>
-        <w:sz w:val="20"/>
-      </w:rPr>
-    </w:lvl>
-    <w:lvl w:ilvl="3" w:tentative="1">
-      <w:start w:val="1"/>
-      <w:numFmt w:val="bullet"/>
-      <w:lvlText w:val=""/>
-      <w:lvlJc w:val="left"/>
-      <w:pPr>
-        <w:tabs>
-          <w:tab w:val="num" w:pos="2880"/>
-        </w:tabs>
-        <w:ind w:left="2880" w:hanging="360"/>
-      </w:pPr>
-      <w:rPr>
-        <w:rFonts w:ascii="Wingdings" w:hAnsi="Wingdings" w:hint="default"/>
-        <w:sz w:val="20"/>
-      </w:rPr>
-    </w:lvl>
-    <w:lvl w:ilvl="4" w:tentative="1">
-      <w:start w:val="1"/>
-      <w:numFmt w:val="bullet"/>
-      <w:lvlText w:val=""/>
-      <w:lvlJc w:val="left"/>
-      <w:pPr>
-        <w:tabs>
-          <w:tab w:val="num" w:pos="3600"/>
-        </w:tabs>
-        <w:ind w:left="3600" w:hanging="360"/>
-      </w:pPr>
-      <w:rPr>
-        <w:rFonts w:ascii="Wingdings" w:hAnsi="Wingdings" w:hint="default"/>
-        <w:sz w:val="20"/>
-      </w:rPr>
-    </w:lvl>
-    <w:lvl w:ilvl="5" w:tentative="1">
-      <w:start w:val="1"/>
-      <w:numFmt w:val="bullet"/>
-      <w:lvlText w:val=""/>
-      <w:lvlJc w:val="left"/>
-      <w:pPr>
-        <w:tabs>
-          <w:tab w:val="num" w:pos="4320"/>
-        </w:tabs>
-        <w:ind w:left="4320" w:hanging="360"/>
-      </w:pPr>
-      <w:rPr>
-        <w:rFonts w:ascii="Wingdings" w:hAnsi="Wingdings" w:hint="default"/>
-        <w:sz w:val="20"/>
-      </w:rPr>
-    </w:lvl>
-    <w:lvl w:ilvl="6" w:tentative="1">
-      <w:start w:val="1"/>
-      <w:numFmt w:val="bullet"/>
-      <w:lvlText w:val=""/>
-      <w:lvlJc w:val="left"/>
-      <w:pPr>
-        <w:tabs>
-          <w:tab w:val="num" w:pos="5040"/>
-        </w:tabs>
-        <w:ind w:left="5040" w:hanging="360"/>
-      </w:pPr>
-      <w:rPr>
-        <w:rFonts w:ascii="Wingdings" w:hAnsi="Wingdings" w:hint="default"/>
-        <w:sz w:val="20"/>
-      </w:rPr>
-    </w:lvl>
-    <w:lvl w:ilvl="7" w:tentative="1">
-      <w:start w:val="1"/>
-      <w:numFmt w:val="bullet"/>
-      <w:lvlText w:val=""/>
-      <w:lvlJc w:val="left"/>
-      <w:pPr>
-        <w:tabs>
-          <w:tab w:val="num" w:pos="5760"/>
-        </w:tabs>
-        <w:ind w:left="5760" w:hanging="360"/>
-      </w:pPr>
-      <w:rPr>
-        <w:rFonts w:ascii="Wingdings" w:hAnsi="Wingdings" w:hint="default"/>
-        <w:sz w:val="20"/>
-      </w:rPr>
-    </w:lvl>
-    <w:lvl w:ilvl="8" w:tentative="1">
-      <w:start w:val="1"/>
-      <w:numFmt w:val="bullet"/>
-      <w:lvlText w:val=""/>
-      <w:lvlJc w:val="left"/>
-      <w:pPr>
-        <w:tabs>
-          <w:tab w:val="num" w:pos="6480"/>
-        </w:tabs>
-        <w:ind w:left="6480" w:hanging="360"/>
-      </w:pPr>
-      <w:rPr>
-        <w:rFonts w:ascii="Wingdings" w:hAnsi="Wingdings" w:hint="default"/>
-        <w:sz w:val="20"/>
-      </w:rPr>
-    </w:lvl>
-  </w:abstractNum>
-  <w:abstractNum w:abstractNumId="8" w15:restartNumberingAfterBreak="0">
-    <w:nsid w:val="3DDF57DE"/>
-    <w:multiLevelType w:val="multilevel"/>
-    <w:tmpl w:val="3146B1EC"/>
-    <w:lvl w:ilvl="0">
-      <w:start w:val="1"/>
-      <w:numFmt w:val="bullet"/>
-      <w:lvlText w:val=""/>
-      <w:lvlJc w:val="left"/>
-      <w:pPr>
-        <w:tabs>
-          <w:tab w:val="num" w:pos="720"/>
-        </w:tabs>
-        <w:ind w:left="720" w:hanging="360"/>
-      </w:pPr>
-      <w:rPr>
-        <w:rFonts w:ascii="Symbol" w:hAnsi="Symbol" w:hint="default"/>
-        <w:sz w:val="20"/>
-      </w:rPr>
-    </w:lvl>
-    <w:lvl w:ilvl="1" w:tentative="1">
-      <w:start w:val="1"/>
-      <w:numFmt w:val="bullet"/>
-      <w:lvlText w:val="o"/>
-      <w:lvlJc w:val="left"/>
-      <w:pPr>
-        <w:tabs>
-          <w:tab w:val="num" w:pos="1440"/>
-        </w:tabs>
-        <w:ind w:left="1440" w:hanging="360"/>
-      </w:pPr>
-      <w:rPr>
-        <w:rFonts w:ascii="Courier New" w:hAnsi="Courier New" w:hint="default"/>
-        <w:sz w:val="20"/>
-      </w:rPr>
-    </w:lvl>
-    <w:lvl w:ilvl="2" w:tentative="1">
-      <w:start w:val="1"/>
-      <w:numFmt w:val="bullet"/>
-      <w:lvlText w:val=""/>
-      <w:lvlJc w:val="left"/>
-      <w:pPr>
-        <w:tabs>
-          <w:tab w:val="num" w:pos="2160"/>
-        </w:tabs>
-        <w:ind w:left="2160" w:hanging="360"/>
-      </w:pPr>
-      <w:rPr>
-        <w:rFonts w:ascii="Wingdings" w:hAnsi="Wingdings" w:hint="default"/>
-        <w:sz w:val="20"/>
-      </w:rPr>
-    </w:lvl>
-    <w:lvl w:ilvl="3" w:tentative="1">
-      <w:start w:val="1"/>
-      <w:numFmt w:val="bullet"/>
-      <w:lvlText w:val=""/>
-      <w:lvlJc w:val="left"/>
-      <w:pPr>
-        <w:tabs>
-          <w:tab w:val="num" w:pos="2880"/>
-        </w:tabs>
-        <w:ind w:left="2880" w:hanging="360"/>
-      </w:pPr>
-      <w:rPr>
-        <w:rFonts w:ascii="Wingdings" w:hAnsi="Wingdings" w:hint="default"/>
-        <w:sz w:val="20"/>
-      </w:rPr>
-    </w:lvl>
-    <w:lvl w:ilvl="4" w:tentative="1">
-      <w:start w:val="1"/>
-      <w:numFmt w:val="bullet"/>
-      <w:lvlText w:val=""/>
-      <w:lvlJc w:val="left"/>
-      <w:pPr>
-        <w:tabs>
-          <w:tab w:val="num" w:pos="3600"/>
-        </w:tabs>
-        <w:ind w:left="3600" w:hanging="360"/>
-      </w:pPr>
-      <w:rPr>
-        <w:rFonts w:ascii="Wingdings" w:hAnsi="Wingdings" w:hint="default"/>
-        <w:sz w:val="20"/>
-      </w:rPr>
-    </w:lvl>
-    <w:lvl w:ilvl="5" w:tentative="1">
-      <w:start w:val="1"/>
-      <w:numFmt w:val="bullet"/>
-      <w:lvlText w:val=""/>
-      <w:lvlJc w:val="left"/>
-      <w:pPr>
-        <w:tabs>
-          <w:tab w:val="num" w:pos="4320"/>
-        </w:tabs>
-        <w:ind w:left="4320" w:hanging="360"/>
-      </w:pPr>
-      <w:rPr>
-        <w:rFonts w:ascii="Wingdings" w:hAnsi="Wingdings" w:hint="default"/>
-        <w:sz w:val="20"/>
-      </w:rPr>
-    </w:lvl>
-    <w:lvl w:ilvl="6" w:tentative="1">
-      <w:start w:val="1"/>
-      <w:numFmt w:val="bullet"/>
-      <w:lvlText w:val=""/>
-      <w:lvlJc w:val="left"/>
-      <w:pPr>
-        <w:tabs>
-          <w:tab w:val="num" w:pos="5040"/>
-        </w:tabs>
-        <w:ind w:left="5040" w:hanging="360"/>
-      </w:pPr>
-      <w:rPr>
-        <w:rFonts w:ascii="Wingdings" w:hAnsi="Wingdings" w:hint="default"/>
-        <w:sz w:val="20"/>
-      </w:rPr>
-    </w:lvl>
-    <w:lvl w:ilvl="7" w:tentative="1">
-      <w:start w:val="1"/>
-      <w:numFmt w:val="bullet"/>
-      <w:lvlText w:val=""/>
-      <w:lvlJc w:val="left"/>
-      <w:pPr>
-        <w:tabs>
-          <w:tab w:val="num" w:pos="5760"/>
-        </w:tabs>
-        <w:ind w:left="5760" w:hanging="360"/>
-      </w:pPr>
-      <w:rPr>
-        <w:rFonts w:ascii="Wingdings" w:hAnsi="Wingdings" w:hint="default"/>
-        <w:sz w:val="20"/>
-      </w:rPr>
-    </w:lvl>
-    <w:lvl w:ilvl="8" w:tentative="1">
-      <w:start w:val="1"/>
-      <w:numFmt w:val="bullet"/>
-      <w:lvlText w:val=""/>
-      <w:lvlJc w:val="left"/>
-      <w:pPr>
-        <w:tabs>
-          <w:tab w:val="num" w:pos="6480"/>
-        </w:tabs>
-        <w:ind w:left="6480" w:hanging="360"/>
-      </w:pPr>
-      <w:rPr>
-        <w:rFonts w:ascii="Wingdings" w:hAnsi="Wingdings" w:hint="default"/>
-        <w:sz w:val="20"/>
-      </w:rPr>
-    </w:lvl>
-  </w:abstractNum>
-  <w:abstractNum w:abstractNumId="9" w15:restartNumberingAfterBreak="0">
-    <w:nsid w:val="4AD75C90"/>
-    <w:multiLevelType w:val="multilevel"/>
-    <w:tmpl w:val="CB922F54"/>
-    <w:lvl w:ilvl="0">
-      <w:start w:val="1"/>
-      <w:numFmt w:val="bullet"/>
-      <w:lvlText w:val=""/>
-      <w:lvlJc w:val="left"/>
-      <w:pPr>
-        <w:tabs>
-          <w:tab w:val="num" w:pos="720"/>
-        </w:tabs>
-        <w:ind w:left="720" w:hanging="360"/>
-      </w:pPr>
-      <w:rPr>
-        <w:rFonts w:ascii="Symbol" w:hAnsi="Symbol" w:hint="default"/>
-        <w:sz w:val="20"/>
-      </w:rPr>
-    </w:lvl>
-    <w:lvl w:ilvl="1" w:tentative="1">
-      <w:start w:val="1"/>
-      <w:numFmt w:val="bullet"/>
-      <w:lvlText w:val="o"/>
-      <w:lvlJc w:val="left"/>
-      <w:pPr>
-        <w:tabs>
-          <w:tab w:val="num" w:pos="1440"/>
-        </w:tabs>
-        <w:ind w:left="1440" w:hanging="360"/>
-      </w:pPr>
-      <w:rPr>
-        <w:rFonts w:ascii="Courier New" w:hAnsi="Courier New" w:hint="default"/>
-        <w:sz w:val="20"/>
-      </w:rPr>
-    </w:lvl>
-    <w:lvl w:ilvl="2" w:tentative="1">
-      <w:start w:val="1"/>
-      <w:numFmt w:val="bullet"/>
-      <w:lvlText w:val=""/>
-      <w:lvlJc w:val="left"/>
-      <w:pPr>
-        <w:tabs>
-          <w:tab w:val="num" w:pos="2160"/>
-        </w:tabs>
-        <w:ind w:left="2160" w:hanging="360"/>
-      </w:pPr>
-      <w:rPr>
-        <w:rFonts w:ascii="Wingdings" w:hAnsi="Wingdings" w:hint="default"/>
-        <w:sz w:val="20"/>
-      </w:rPr>
-    </w:lvl>
-    <w:lvl w:ilvl="3" w:tentative="1">
-      <w:start w:val="1"/>
-      <w:numFmt w:val="bullet"/>
-      <w:lvlText w:val=""/>
-      <w:lvlJc w:val="left"/>
-      <w:pPr>
-        <w:tabs>
-          <w:tab w:val="num" w:pos="2880"/>
-        </w:tabs>
-        <w:ind w:left="2880" w:hanging="360"/>
-      </w:pPr>
-      <w:rPr>
-        <w:rFonts w:ascii="Wingdings" w:hAnsi="Wingdings" w:hint="default"/>
-        <w:sz w:val="20"/>
-      </w:rPr>
-    </w:lvl>
-    <w:lvl w:ilvl="4" w:tentative="1">
-      <w:start w:val="1"/>
-      <w:numFmt w:val="bullet"/>
-      <w:lvlText w:val=""/>
-      <w:lvlJc w:val="left"/>
-      <w:pPr>
-        <w:tabs>
-          <w:tab w:val="num" w:pos="3600"/>
-        </w:tabs>
-        <w:ind w:left="3600" w:hanging="360"/>
-      </w:pPr>
-      <w:rPr>
-        <w:rFonts w:ascii="Wingdings" w:hAnsi="Wingdings" w:hint="default"/>
-        <w:sz w:val="20"/>
-      </w:rPr>
-    </w:lvl>
-    <w:lvl w:ilvl="5" w:tentative="1">
-      <w:start w:val="1"/>
-      <w:numFmt w:val="bullet"/>
-      <w:lvlText w:val=""/>
-      <w:lvlJc w:val="left"/>
-      <w:pPr>
-        <w:tabs>
-          <w:tab w:val="num" w:pos="4320"/>
-        </w:tabs>
-        <w:ind w:left="4320" w:hanging="360"/>
-      </w:pPr>
-      <w:rPr>
-        <w:rFonts w:ascii="Wingdings" w:hAnsi="Wingdings" w:hint="default"/>
-        <w:sz w:val="20"/>
-      </w:rPr>
-    </w:lvl>
-    <w:lvl w:ilvl="6" w:tentative="1">
-      <w:start w:val="1"/>
-      <w:numFmt w:val="bullet"/>
-      <w:lvlText w:val=""/>
-      <w:lvlJc w:val="left"/>
-      <w:pPr>
-        <w:tabs>
-          <w:tab w:val="num" w:pos="5040"/>
-        </w:tabs>
-        <w:ind w:left="5040" w:hanging="360"/>
-      </w:pPr>
-      <w:rPr>
-        <w:rFonts w:ascii="Wingdings" w:hAnsi="Wingdings" w:hint="default"/>
-        <w:sz w:val="20"/>
-      </w:rPr>
-    </w:lvl>
-    <w:lvl w:ilvl="7" w:tentative="1">
-      <w:start w:val="1"/>
-      <w:numFmt w:val="bullet"/>
-      <w:lvlText w:val=""/>
-      <w:lvlJc w:val="left"/>
-      <w:pPr>
-        <w:tabs>
-          <w:tab w:val="num" w:pos="5760"/>
-        </w:tabs>
-        <w:ind w:left="5760" w:hanging="360"/>
-      </w:pPr>
-      <w:rPr>
-        <w:rFonts w:ascii="Wingdings" w:hAnsi="Wingdings" w:hint="default"/>
-        <w:sz w:val="20"/>
-      </w:rPr>
-    </w:lvl>
-    <w:lvl w:ilvl="8" w:tentative="1">
-      <w:start w:val="1"/>
-      <w:numFmt w:val="bullet"/>
-      <w:lvlText w:val=""/>
-      <w:lvlJc w:val="left"/>
-      <w:pPr>
-        <w:tabs>
-          <w:tab w:val="num" w:pos="6480"/>
-        </w:tabs>
-        <w:ind w:left="6480" w:hanging="360"/>
-      </w:pPr>
-      <w:rPr>
-        <w:rFonts w:ascii="Wingdings" w:hAnsi="Wingdings" w:hint="default"/>
-        <w:sz w:val="20"/>
-      </w:rPr>
-    </w:lvl>
-  </w:abstractNum>
-  <w:abstractNum w:abstractNumId="10" w15:restartNumberingAfterBreak="0">
-    <w:nsid w:val="50454027"/>
-    <w:multiLevelType w:val="multilevel"/>
-    <w:tmpl w:val="A906F53C"/>
+    <w:tmpl w:val="310E4AA8"/>
     <w:lvl w:ilvl="0">
       <w:start w:val="1"/>
       <w:numFmt w:val="bullet"/>
@@ -7506,9 +7740,9 @@
     </w:lvl>
   </w:abstractNum>
   <w:abstractNum w:abstractNumId="11" w15:restartNumberingAfterBreak="0">
-    <w:nsid w:val="59416A99"/>
+    <w:nsid w:val="50824AEE"/>
     <w:multiLevelType w:val="multilevel"/>
-    <w:tmpl w:val="7450BACA"/>
+    <w:tmpl w:val="85547DAC"/>
     <w:lvl w:ilvl="0">
       <w:start w:val="1"/>
       <w:numFmt w:val="bullet"/>
@@ -7655,9 +7889,9 @@
     </w:lvl>
   </w:abstractNum>
   <w:abstractNum w:abstractNumId="12" w15:restartNumberingAfterBreak="0">
-    <w:nsid w:val="5ECC7180"/>
+    <w:nsid w:val="53C03EC4"/>
     <w:multiLevelType w:val="multilevel"/>
-    <w:tmpl w:val="01600BF4"/>
+    <w:tmpl w:val="676E7E1C"/>
     <w:lvl w:ilvl="0">
       <w:start w:val="1"/>
       <w:numFmt w:val="bullet"/>
@@ -7804,9 +8038,9 @@
     </w:lvl>
   </w:abstractNum>
   <w:abstractNum w:abstractNumId="13" w15:restartNumberingAfterBreak="0">
-    <w:nsid w:val="786B02C5"/>
+    <w:nsid w:val="53D72656"/>
     <w:multiLevelType w:val="multilevel"/>
-    <w:tmpl w:val="DE2AA902"/>
+    <w:tmpl w:val="C7EEA1C2"/>
     <w:lvl w:ilvl="0">
       <w:start w:val="1"/>
       <w:numFmt w:val="bullet"/>
@@ -7953,9 +8187,9 @@
     </w:lvl>
   </w:abstractNum>
   <w:abstractNum w:abstractNumId="14" w15:restartNumberingAfterBreak="0">
-    <w:nsid w:val="7DD0703E"/>
+    <w:nsid w:val="713419A8"/>
     <w:multiLevelType w:val="multilevel"/>
-    <w:tmpl w:val="B3B83F0E"/>
+    <w:tmpl w:val="069282E0"/>
     <w:lvl w:ilvl="0">
       <w:start w:val="1"/>
       <w:numFmt w:val="bullet"/>
@@ -8101,50 +8335,50 @@
       </w:rPr>
     </w:lvl>
   </w:abstractNum>
-  <w:num w:numId="1" w16cid:durableId="2068457776">
+  <w:num w:numId="1" w16cid:durableId="1299724803">
+    <w:abstractNumId w:val="12"/>
+  </w:num>
+  <w:num w:numId="2" w16cid:durableId="1978562916">
+    <w:abstractNumId w:val="7"/>
+  </w:num>
+  <w:num w:numId="3" w16cid:durableId="1086225350">
+    <w:abstractNumId w:val="10"/>
+  </w:num>
+  <w:num w:numId="4" w16cid:durableId="1952853539">
+    <w:abstractNumId w:val="5"/>
+  </w:num>
+  <w:num w:numId="5" w16cid:durableId="304355828">
+    <w:abstractNumId w:val="8"/>
+  </w:num>
+  <w:num w:numId="6" w16cid:durableId="1723359839">
+    <w:abstractNumId w:val="4"/>
+  </w:num>
+  <w:num w:numId="7" w16cid:durableId="925454046">
     <w:abstractNumId w:val="9"/>
   </w:num>
-  <w:num w:numId="2" w16cid:durableId="1183055883">
+  <w:num w:numId="8" w16cid:durableId="1533378190">
     <w:abstractNumId w:val="11"/>
   </w:num>
-  <w:num w:numId="3" w16cid:durableId="1470979288">
-    <w:abstractNumId w:val="10"/>
+  <w:num w:numId="9" w16cid:durableId="183910326">
+    <w:abstractNumId w:val="13"/>
   </w:num>
-  <w:num w:numId="4" w16cid:durableId="5254101">
+  <w:num w:numId="10" w16cid:durableId="488523089">
+    <w:abstractNumId w:val="14"/>
+  </w:num>
+  <w:num w:numId="11" w16cid:durableId="1063260337">
+    <w:abstractNumId w:val="0"/>
+  </w:num>
+  <w:num w:numId="12" w16cid:durableId="509375151">
+    <w:abstractNumId w:val="3"/>
+  </w:num>
+  <w:num w:numId="13" w16cid:durableId="324093377">
     <w:abstractNumId w:val="1"/>
   </w:num>
-  <w:num w:numId="5" w16cid:durableId="204294258">
-    <w:abstractNumId w:val="8"/>
-  </w:num>
-  <w:num w:numId="6" w16cid:durableId="252130829">
-    <w:abstractNumId w:val="13"/>
-  </w:num>
-  <w:num w:numId="7" w16cid:durableId="726345940">
+  <w:num w:numId="14" w16cid:durableId="494103629">
     <w:abstractNumId w:val="6"/>
   </w:num>
-  <w:num w:numId="8" w16cid:durableId="1558855420">
+  <w:num w:numId="15" w16cid:durableId="642387342">
     <w:abstractNumId w:val="2"/>
-  </w:num>
-  <w:num w:numId="9" w16cid:durableId="1057782852">
-    <w:abstractNumId w:val="14"/>
-  </w:num>
-  <w:num w:numId="10" w16cid:durableId="1333989225">
-    <w:abstractNumId w:val="5"/>
-  </w:num>
-  <w:num w:numId="11" w16cid:durableId="1856462587">
-    <w:abstractNumId w:val="12"/>
-  </w:num>
-  <w:num w:numId="12" w16cid:durableId="1226993081">
-    <w:abstractNumId w:val="4"/>
-  </w:num>
-  <w:num w:numId="13" w16cid:durableId="876090083">
-    <w:abstractNumId w:val="3"/>
-  </w:num>
-  <w:num w:numId="14" w16cid:durableId="1572160115">
-    <w:abstractNumId w:val="7"/>
-  </w:num>
-  <w:num w:numId="15" w16cid:durableId="879517379">
-    <w:abstractNumId w:val="0"/>
   </w:num>
 </w:numbering>
 </file>
@@ -8637,6 +8871,28 @@
     <w:semiHidden/>
     <w:unhideWhenUsed/>
   </w:style>
+  <w:style w:type="character" w:styleId="Hipervnculo">
+    <w:name w:val="Hyperlink"/>
+    <w:basedOn w:val="Fuentedeprrafopredeter"/>
+    <w:uiPriority w:val="99"/>
+    <w:semiHidden/>
+    <w:unhideWhenUsed/>
+    <w:rPr>
+      <w:color w:val="1F6F4A"/>
+      <w:u w:val="single"/>
+    </w:rPr>
+  </w:style>
+  <w:style w:type="character" w:styleId="Hipervnculovisitado">
+    <w:name w:val="FollowedHyperlink"/>
+    <w:basedOn w:val="Fuentedeprrafopredeter"/>
+    <w:uiPriority w:val="99"/>
+    <w:semiHidden/>
+    <w:unhideWhenUsed/>
+    <w:rPr>
+      <w:color w:val="1F6F4A"/>
+      <w:u w:val="single"/>
+    </w:rPr>
+  </w:style>
   <w:style w:type="character" w:styleId="CdigoHTML">
     <w:name w:val="HTML Code"/>
     <w:basedOn w:val="Fuentedeprrafopredeter"/>

</xml_diff>